<commit_message>
DAR-2026-56: integrar opiniones de Gerencia Legal y Oficialía de Cumplimiento, alertas y recomendaciones por área
Se mantiene la estructura del DAR-2026-29 (Antecedentes, Evaluación de
riesgo, Conclusión, Recomendación).

Co-Authored-By: Claude Opus 5.5 <noreply@anthropic.com>
Claude-Session: https://claude.ai/code/session_019v6pd36FfCTKWdmbaW6yXF
</commit_message>
<xml_diff>
--- a/DAR-2026-56_Opinion_Jonnathan_Jacobo_Marroquin.docx
+++ b/DAR-2026-56_Opinion_Jonnathan_Jacobo_Marroquin.docx
@@ -183,16 +183,16 @@
           <w:lang w:eastAsia="es-SV"/>
           <w14:ligatures w14:val="none"/>
         </w:rPr>
-        <w:t xml:space="preserve">Jonnathan Jacobo Marroquín</w:t>
-      </w:r>
-      <w:r>
-        <w:rPr>
-          <w:rFonts w:ascii="Arial" w:eastAsia="Times New Roman" w:hAnsi="Arial" w:cs="Arial"/>
-          <w:kern w:val="0"/>
-          <w:lang w:eastAsia="es-SV"/>
-          <w14:ligatures w14:val="none"/>
-        </w:rPr>
-        <w:t xml:space="preserve"> y a la Gerencia Legal emitir pronunciamiento sobre la constitución de reserva sobre sus haberes, específicamente la cuenta de Ahorro Premium por US$53,681.26, se emite el siguiente análisis:</w:t>
+        <w:t xml:space="preserve">Dr. Jonnathan Jacobo Marroquín</w:t>
+      </w:r>
+      <w:r>
+        <w:rPr>
+          <w:rFonts w:ascii="Arial" w:eastAsia="Times New Roman" w:hAnsi="Arial" w:cs="Arial"/>
+          <w:kern w:val="0"/>
+          <w:lang w:eastAsia="es-SV"/>
+          <w14:ligatures w14:val="none"/>
+        </w:rPr>
+        <w:t xml:space="preserve"> y a la Gerencia Legal y de Cumplimiento Normativo emitir pronunciamiento sobre la constitución de reserva sobre sus haberes, específicamente la cuenta de Ahorro Premium por US$53,681.26, se emite el siguiente análisis, el cual integra las opiniones de la Gerencia Legal y de Cumplimiento Normativo y de la Oficialía de Cumplimiento:</w:t>
       </w:r>
     </w:p>
     <w:p>
@@ -300,7 +300,7 @@
           <w:lang w:eastAsia="es-SV"/>
           <w14:ligatures w14:val="none"/>
         </w:rPr>
-        <w:t xml:space="preserve">La Gerencia Legal emitió criterio respecto a la reserva constituida, estableciendo que corresponde a una medida preventiva de control interno y monitoreo reforzado, sin que constituya una inmovilización o restricción legal de los fondos depositados.</w:t>
+        <w:t xml:space="preserve">De la revisión del expediente se verificó que el asociado mantiene vigente el contrato de Ahorro Premium con vencimiento el 19 de agosto de 2070, con un saldo de US$53,681.26; no existe orden judicial, administrativa o requerimiento formal de autoridad competente que restrinja la disponibilidad de los fondos, ni medidas cautelares de embargo, inmovilización o secuestro de bienes.</w:t>
       </w:r>
     </w:p>
     <w:p>
@@ -341,7 +341,7 @@
           <w:lang w:eastAsia="es-SV"/>
           <w14:ligatures w14:val="none"/>
         </w:rPr>
-        <w:t xml:space="preserve">De la revisión del expediente se verificó que el asociado mantiene vigente el contrato de Ahorro Premium con vencimiento el 19 de agosto de 2070, con un saldo de US$53,681.26; no existe orden judicial, administrativa o requerimiento formal de autoridad competente que restrinja la disponibilidad de los fondos, ni medidas cautelares de embargo, inmovilización o secuestro de bienes.</w:t>
+        <w:t xml:space="preserve">El asociado mantiene dos créditos con garantía prendaria a favor de COMÉDICA DE R.L., los cuales se encuentran vigentes y al día, con pagos realizados mediante cargos y transferencias provenientes de la cuenta Premium, cuyos recursos continúan constituyendo respaldo para el cumplimiento de dichas obligaciones.</w:t>
       </w:r>
     </w:p>
     <w:p>
@@ -378,11 +378,22 @@
       <w:r>
         <w:rPr>
           <w:rFonts w:ascii="Arial" w:eastAsia="Times New Roman" w:hAnsi="Arial" w:cs="Arial"/>
-          <w:kern w:val="0"/>
-          <w:lang w:eastAsia="es-SV"/>
-          <w14:ligatures w14:val="none"/>
-        </w:rPr>
-        <w:t xml:space="preserve">Las obligaciones crediticias del asociado mantienen un comportamiento normal de pago, realizándose mediante cargos y transferencias provenientes de la cuenta Premium, cuyos recursos continúan constituyendo respaldo para el cumplimiento de dichas obligaciones.</w:t>
+          <w:b/>
+          <w:bCs/>
+          <w:kern w:val="0"/>
+          <w:lang w:eastAsia="es-SV"/>
+          <w14:ligatures w14:val="none"/>
+        </w:rPr>
+        <w:t xml:space="preserve">Investigación del caso: </w:t>
+      </w:r>
+      <w:r>
+        <w:rPr>
+          <w:rFonts w:ascii="Arial" w:eastAsia="Times New Roman" w:hAnsi="Arial" w:cs="Arial"/>
+          <w:kern w:val="0"/>
+          <w:lang w:eastAsia="es-SV"/>
+          <w14:ligatures w14:val="none"/>
+        </w:rPr>
+        <w:t xml:space="preserve">de acuerdo con información de carácter público (comunicados de la Fiscalía General de la República e informes de medios nacionales como Diario El Salvador, Diario1 e Infobae), el 13 de febrero de 2026 la FGR y la PNC ejecutaron un operativo para desarticular una estructura dedicada al narcotráfico internacional, con vínculos en Guatemala, en el cual figura entre las personas capturadas una persona identificada como Jonnathan Jacobo Marroquín. Según la FGR, los imputados serían procesados por los delitos de tráfico ilícito, cooperación en el delito de tráfico de drogas, agrupaciones ilícitas, cohecho activo y cohecho impropio; en los allanamientos se reportó el decomiso de drogas, medicamentos controlados, dinero en efectivo y vehículos.</w:t>
       </w:r>
     </w:p>
     <w:p>
@@ -419,22 +430,11 @@
       <w:r>
         <w:rPr>
           <w:rFonts w:ascii="Arial" w:eastAsia="Times New Roman" w:hAnsi="Arial" w:cs="Arial"/>
-          <w:b/>
-          <w:bCs/>
-          <w:kern w:val="0"/>
-          <w:lang w:eastAsia="es-SV"/>
-          <w14:ligatures w14:val="none"/>
-        </w:rPr>
-        <w:t xml:space="preserve">Investigación del caso: </w:t>
-      </w:r>
-      <w:r>
-        <w:rPr>
-          <w:rFonts w:ascii="Arial" w:eastAsia="Times New Roman" w:hAnsi="Arial" w:cs="Arial"/>
-          <w:kern w:val="0"/>
-          <w:lang w:eastAsia="es-SV"/>
-          <w14:ligatures w14:val="none"/>
-        </w:rPr>
-        <w:t xml:space="preserve">de acuerdo con información de carácter público (comunicados de la Fiscalía General de la República e informes de medios nacionales como Diario El Salvador, Diario1 e Infobae), el 13 de febrero de 2026 la FGR y la PNC ejecutaron un operativo para desarticular una estructura dedicada al narcotráfico internacional, con vínculos en Guatemala, en el cual figura entre las personas capturadas una persona identificada como Jonnathan Jacobo Marroquín.</w:t>
+          <w:kern w:val="0"/>
+          <w:lang w:eastAsia="es-SV"/>
+          <w14:ligatures w14:val="none"/>
+        </w:rPr>
+        <w:t xml:space="preserve">El 04 de marzo de 2026, la FGR informó que se decretó instrucción formal con detención provisional contra los integrantes de dicha estructura, por lo que el proceso penal se encuentra en curso y no existe, a la fecha, sentencia condenatoria conocida. Las fuentes públicas no detallan el rol específico atribuido a la persona señalada, por lo que es necesario confirmar la identidad (número de DUI) para descartar un caso de homonimia.</w:t>
       </w:r>
     </w:p>
     <w:p>
@@ -471,11 +471,22 @@
       <w:r>
         <w:rPr>
           <w:rFonts w:ascii="Arial" w:eastAsia="Times New Roman" w:hAnsi="Arial" w:cs="Arial"/>
-          <w:kern w:val="0"/>
-          <w:lang w:eastAsia="es-SV"/>
-          <w14:ligatures w14:val="none"/>
-        </w:rPr>
-        <w:t xml:space="preserve">Según la FGR, los imputados serían procesados por los delitos de tráfico ilícito, cooperación en el delito de tráfico de drogas, agrupaciones ilícitas, cohecho activo y cohecho impropio. En los allanamientos se reportó el decomiso de metanfetamina, cocaína, marihuana, la droga conocida como "tusi", medicamentos controlados, dinero en efectivo y vehículos.</w:t>
+          <w:b/>
+          <w:bCs/>
+          <w:kern w:val="0"/>
+          <w:lang w:eastAsia="es-SV"/>
+          <w14:ligatures w14:val="none"/>
+        </w:rPr>
+        <w:t xml:space="preserve">Opinión de la Gerencia Legal y de Cumplimiento Normativo: </w:t>
+      </w:r>
+      <w:r>
+        <w:rPr>
+          <w:rFonts w:ascii="Arial" w:eastAsia="Times New Roman" w:hAnsi="Arial" w:cs="Arial"/>
+          <w:kern w:val="0"/>
+          <w:lang w:eastAsia="es-SV"/>
+          <w14:ligatures w14:val="none"/>
+        </w:rPr>
+        <w:t xml:space="preserve">no existen elementos objetivos que permitan concluir que las garantías prendarias constituidas a favor de COMÉDICA DE R.L. hayan perdido eficacia jurídica o se encuentren afectadas por restricciones registrales. Asimismo, no existe fundamento contractual o legal suficiente para inmovilizar, compensar, retener o restringir de forma unilateral los fondos de la cuenta de Ahorro Premium mientras no exista orden de autoridad competente, siendo procedente la constitución de una reserva interna de monitoreo y seguimiento reforzado, conforme a lo instruido por el Consejo de Administración.</w:t>
       </w:r>
     </w:p>
     <w:p>
@@ -512,11 +523,22 @@
       <w:r>
         <w:rPr>
           <w:rFonts w:ascii="Arial" w:eastAsia="Times New Roman" w:hAnsi="Arial" w:cs="Arial"/>
-          <w:kern w:val="0"/>
-          <w:lang w:eastAsia="es-SV"/>
-          <w14:ligatures w14:val="none"/>
-        </w:rPr>
-        <w:t xml:space="preserve">Posteriormente, el 04 de marzo de 2026, la FGR informó que se decretó instrucción formal con detención provisional contra los integrantes de dicha estructura, por lo que el proceso penal se encuentra en curso y no existe, a la fecha, sentencia condenatoria conocida. Las fuentes públicas no detallan el rol específico atribuido a la persona señalada, y es necesario confirmar la identidad (número de DUI) para descartar un caso de homonimia.</w:t>
+          <w:b/>
+          <w:bCs/>
+          <w:kern w:val="0"/>
+          <w:lang w:eastAsia="es-SV"/>
+          <w14:ligatures w14:val="none"/>
+        </w:rPr>
+        <w:t xml:space="preserve">Opinión de la Oficialía de Cumplimiento: </w:t>
+      </w:r>
+      <w:r>
+        <w:rPr>
+          <w:rFonts w:ascii="Arial" w:eastAsia="Times New Roman" w:hAnsi="Arial" w:cs="Arial"/>
+          <w:kern w:val="0"/>
+          <w:lang w:eastAsia="es-SV"/>
+          <w14:ligatures w14:val="none"/>
+        </w:rPr>
+        <w:t xml:space="preserve">el asociado se encuentra catalogado con perfil de riesgo Medio-Alto. Dicha área realizó previamente el análisis correspondiente, determinando que, conforme a la regulación vigente, esta situación por sí sola no permite considerarlo completamente de alto riesgo, y realizará una revisión posterior para reclasificarlo si fuera necesario.</w:t>
       </w:r>
     </w:p>
     <w:p>
@@ -599,7 +621,7 @@
           <w:lang w:eastAsia="es-SV"/>
           <w14:ligatures w14:val="none"/>
         </w:rPr>
-        <w:t xml:space="preserve">No se identifican evidencias de deterioro en la capacidad de pago, incumplimiento de obligaciones, insuficiencia de garantías o factores que afecten la recuperación de los créditos. De conformidad con la NCB-022, la situación analizada no constituye por sí misma una causal de reclasificación de la categoría de riesgo crediticio. No obstante, la detención provisional reportada podría afectar la fuente de ingresos del asociado, por lo que la atención de las obligaciones depende actualmente de los fondos de la cuenta Premium. </w:t>
+        <w:t xml:space="preserve">No se identifican evidencias de deterioro en la capacidad de pago, incumplimiento de obligaciones, insuficiencia de garantías o factores que afecten la recuperación de los créditos; las garantías prendarias conservan su eficacia jurídica según la Gerencia Legal. De conformidad con la NCB-022, la situación analizada no constituye por sí misma una causal de reclasificación de la categoría de riesgo crediticio. No obstante, la detención provisional reportada podría afectar la fuente de ingresos del asociado, por lo que la atención de las obligaciones depende actualmente de los fondos de la cuenta Premium. </w:t>
       </w:r>
       <w:r>
         <w:rPr>
@@ -714,16 +736,16 @@
           <w:lang w:eastAsia="es-SV"/>
           <w14:ligatures w14:val="none"/>
         </w:rPr>
-        <w:t xml:space="preserve">Riesgo de mercado: </w:t>
-      </w:r>
-      <w:r>
-        <w:rPr>
-          <w:rFonts w:ascii="Arial" w:eastAsia="Times New Roman" w:hAnsi="Arial" w:cs="Arial"/>
-          <w:kern w:val="0"/>
-          <w:lang w:eastAsia="es-SV"/>
-          <w14:ligatures w14:val="none"/>
-        </w:rPr>
-        <w:t xml:space="preserve">No se identifican impactos relacionados con tasas de interés, tipo de cambio u otros factores de mercado. </w:t>
+        <w:t xml:space="preserve">Riesgo reputacional: </w:t>
+      </w:r>
+      <w:r>
+        <w:rPr>
+          <w:rFonts w:ascii="Arial" w:eastAsia="Times New Roman" w:hAnsi="Arial" w:cs="Arial"/>
+          <w:kern w:val="0"/>
+          <w:lang w:eastAsia="es-SV"/>
+          <w14:ligatures w14:val="none"/>
+        </w:rPr>
+        <w:t xml:space="preserve">La vinculación pública del asociado con un proceso penal por narcotráfico, agrupaciones ilícitas y cohecho, difundida en medios de comunicación nacionales, genera una exposición reputacional relevante para la Institución y demanda monitoreo constante. </w:t>
       </w:r>
       <w:r>
         <w:rPr>
@@ -734,7 +756,7 @@
           <w:lang w:eastAsia="es-SV"/>
           <w14:ligatures w14:val="none"/>
         </w:rPr>
-        <w:t xml:space="preserve">Nivel de riesgo: Bajo.</w:t>
+        <w:t xml:space="preserve">Nivel de riesgo: Alto.</w:t>
       </w:r>
     </w:p>
     <w:p>
@@ -776,16 +798,16 @@
           <w:lang w:eastAsia="es-SV"/>
           <w14:ligatures w14:val="none"/>
         </w:rPr>
-        <w:t xml:space="preserve">Riesgo operacional: </w:t>
-      </w:r>
-      <w:r>
-        <w:rPr>
-          <w:rFonts w:ascii="Arial" w:eastAsia="Times New Roman" w:hAnsi="Arial" w:cs="Arial"/>
-          <w:kern w:val="0"/>
-          <w:lang w:eastAsia="es-SV"/>
-          <w14:ligatures w14:val="none"/>
-        </w:rPr>
-        <w:t xml:space="preserve">Existe riesgo de errores en la ejecución de instrucciones, aplicación indebida de restricciones o gestión inadecuada de operaciones relacionadas con el asociado, considerando que la reserva interna no constituye una restricción legal. </w:t>
+        <w:t xml:space="preserve">Riesgo legal y operacional: </w:t>
+      </w:r>
+      <w:r>
+        <w:rPr>
+          <w:rFonts w:ascii="Arial" w:eastAsia="Times New Roman" w:hAnsi="Arial" w:cs="Arial"/>
+          <w:kern w:val="0"/>
+          <w:lang w:eastAsia="es-SV"/>
+          <w14:ligatures w14:val="none"/>
+        </w:rPr>
+        <w:t xml:space="preserve">La aplicación de restricciones sobre los fondos sin orden de autoridad competente podría generar contingencias legales para la Institución. Asimismo, los bienes dados en garantía prendaria podrían verse afectados en caso de decretarse anotaciones preventivas, secuestro, decomiso o extinción de dominio, en cuyo caso la Institución deberá acatar la medida de forma inmediata y salvaguardar su derecho preferente. En el ámbito operativo, existe riesgo de errores en la ejecución de instrucciones o aplicación indebida de restricciones, considerando que la reserva interna no constituye una restricción legal. </w:t>
       </w:r>
       <w:r>
         <w:rPr>
@@ -796,7 +818,7 @@
           <w:lang w:eastAsia="es-SV"/>
           <w14:ligatures w14:val="none"/>
         </w:rPr>
-        <w:t xml:space="preserve">Nivel de riesgo: Medio-Alto.</w:t>
+        <w:t xml:space="preserve">Nivel de riesgo: Alto.</w:t>
       </w:r>
     </w:p>
     <w:p>
@@ -838,16 +860,16 @@
           <w:lang w:eastAsia="es-SV"/>
           <w14:ligatures w14:val="none"/>
         </w:rPr>
-        <w:t xml:space="preserve">Riesgo reputacional: </w:t>
-      </w:r>
-      <w:r>
-        <w:rPr>
-          <w:rFonts w:ascii="Arial" w:eastAsia="Times New Roman" w:hAnsi="Arial" w:cs="Arial"/>
-          <w:kern w:val="0"/>
-          <w:lang w:eastAsia="es-SV"/>
-          <w14:ligatures w14:val="none"/>
-        </w:rPr>
-        <w:t xml:space="preserve">La vinculación pública del asociado con un proceso penal por narcotráfico, agrupaciones ilícitas y cohecho, difundida en medios de comunicación nacionales, genera una exposición reputacional relevante para la Institución y demanda monitoreo constante. </w:t>
+        <w:t xml:space="preserve">Riesgo de lavado de dinero: </w:t>
+      </w:r>
+      <w:r>
+        <w:rPr>
+          <w:rFonts w:ascii="Arial" w:eastAsia="Times New Roman" w:hAnsi="Arial" w:cs="Arial"/>
+          <w:kern w:val="0"/>
+          <w:lang w:eastAsia="es-SV"/>
+          <w14:ligatures w14:val="none"/>
+        </w:rPr>
+        <w:t xml:space="preserve">Los delitos imputados en el proceso público (tráfico ilícito de drogas, agrupaciones ilícitas y cohecho) constituyen delitos precedentes de lavado de dinero y activos. La Oficialía de Cumplimiento mantiene al asociado con perfil Medio-Alto, sujeto a revisión posterior; en consecuencia, se requiere debida diligencia reforzada, verificación del origen de los fondos de la cuenta Premium y evaluación, conforme a criterio de dicha área, de la pertinencia de un Reporte de Operación Sospechosa ante la UIF. </w:t>
       </w:r>
       <w:r>
         <w:rPr>
@@ -858,131 +880,7 @@
           <w:lang w:eastAsia="es-SV"/>
           <w14:ligatures w14:val="none"/>
         </w:rPr>
-        <w:t xml:space="preserve">Nivel de riesgo: Alto.</w:t>
-      </w:r>
-    </w:p>
-    <w:p>
-      <w:pPr>
-        <w:pStyle w:val="Prrafodelista"/>
-        <w:spacing w:line="360" w:lineRule="auto"/>
-        <w:ind w:left="1080"/>
-        <w:jc w:val="both"/>
-        <w:rPr>
-          <w:rFonts w:ascii="Arial" w:eastAsia="Times New Roman" w:hAnsi="Arial" w:cs="Arial"/>
-          <w:kern w:val="0"/>
-          <w:lang w:eastAsia="es-SV"/>
-          <w14:ligatures w14:val="none"/>
-        </w:rPr>
-      </w:pPr>
-    </w:p>
-    <w:p>
-      <w:pPr>
-        <w:pStyle w:val="Prrafodelista"/>
-        <w:numPr>
-          <w:ilvl w:val="0"/>
-          <w:numId w:val="19"/>
-        </w:numPr>
-        <w:spacing w:line="360" w:lineRule="auto"/>
-        <w:jc w:val="both"/>
-        <w:rPr>
-          <w:rFonts w:ascii="Arial" w:eastAsia="Times New Roman" w:hAnsi="Arial" w:cs="Arial"/>
-          <w:kern w:val="0"/>
-          <w:lang w:eastAsia="es-SV"/>
-          <w14:ligatures w14:val="none"/>
-        </w:rPr>
-      </w:pPr>
-      <w:r>
-        <w:rPr>
-          <w:rFonts w:ascii="Arial" w:eastAsia="Times New Roman" w:hAnsi="Arial" w:cs="Arial"/>
-          <w:b/>
-          <w:bCs/>
-          <w:kern w:val="0"/>
-          <w:lang w:eastAsia="es-SV"/>
-          <w14:ligatures w14:val="none"/>
-        </w:rPr>
-        <w:t xml:space="preserve">Riesgo legal: </w:t>
-      </w:r>
-      <w:r>
-        <w:rPr>
-          <w:rFonts w:ascii="Arial" w:eastAsia="Times New Roman" w:hAnsi="Arial" w:cs="Arial"/>
-          <w:kern w:val="0"/>
-          <w:lang w:eastAsia="es-SV"/>
-          <w14:ligatures w14:val="none"/>
-        </w:rPr>
-        <w:t xml:space="preserve">La aplicación de restricciones sobre los fondos sin orden de autoridad competente podría generar contingencias legales para la Institución. Asimismo, en caso de emitirse una medida cautelar o de extinción de dominio, la Institución deberá acatarla de forma inmediata. </w:t>
-      </w:r>
-      <w:r>
-        <w:rPr>
-          <w:rFonts w:ascii="Arial" w:eastAsia="Times New Roman" w:hAnsi="Arial" w:cs="Arial"/>
-          <w:b/>
-          <w:bCs/>
-          <w:kern w:val="0"/>
-          <w:lang w:eastAsia="es-SV"/>
-          <w14:ligatures w14:val="none"/>
-        </w:rPr>
-        <w:t xml:space="preserve">Nivel de riesgo: Alto.</w:t>
-      </w:r>
-    </w:p>
-    <w:p>
-      <w:pPr>
-        <w:pStyle w:val="Prrafodelista"/>
-        <w:spacing w:line="360" w:lineRule="auto"/>
-        <w:ind w:left="1080"/>
-        <w:jc w:val="both"/>
-        <w:rPr>
-          <w:rFonts w:ascii="Arial" w:eastAsia="Times New Roman" w:hAnsi="Arial" w:cs="Arial"/>
-          <w:kern w:val="0"/>
-          <w:lang w:eastAsia="es-SV"/>
-          <w14:ligatures w14:val="none"/>
-        </w:rPr>
-      </w:pPr>
-    </w:p>
-    <w:p>
-      <w:pPr>
-        <w:pStyle w:val="Prrafodelista"/>
-        <w:numPr>
-          <w:ilvl w:val="0"/>
-          <w:numId w:val="19"/>
-        </w:numPr>
-        <w:spacing w:line="360" w:lineRule="auto"/>
-        <w:jc w:val="both"/>
-        <w:rPr>
-          <w:rFonts w:ascii="Arial" w:eastAsia="Times New Roman" w:hAnsi="Arial" w:cs="Arial"/>
-          <w:kern w:val="0"/>
-          <w:lang w:eastAsia="es-SV"/>
-          <w14:ligatures w14:val="none"/>
-        </w:rPr>
-      </w:pPr>
-      <w:r>
-        <w:rPr>
-          <w:rFonts w:ascii="Arial" w:eastAsia="Times New Roman" w:hAnsi="Arial" w:cs="Arial"/>
-          <w:b/>
-          <w:bCs/>
-          <w:kern w:val="0"/>
-          <w:lang w:eastAsia="es-SV"/>
-          <w14:ligatures w14:val="none"/>
-        </w:rPr>
-        <w:t xml:space="preserve">Riesgo de lavado de dinero: </w:t>
-      </w:r>
-      <w:r>
-        <w:rPr>
-          <w:rFonts w:ascii="Arial" w:eastAsia="Times New Roman" w:hAnsi="Arial" w:cs="Arial"/>
-          <w:kern w:val="0"/>
-          <w:lang w:eastAsia="es-SV"/>
-          <w14:ligatures w14:val="none"/>
-        </w:rPr>
-        <w:t xml:space="preserve">Los delitos imputados en el proceso público (tráfico ilícito de drogas, agrupaciones ilícitas y cohecho) constituyen delitos precedentes de lavado de dinero y activos. En consecuencia, la operación requiere: que la Oficialía de Cumplimiento realice debida diligencia reforzada, verifique el origen de los fondos depositados en la cuenta Premium y evalúe, conforme a su criterio, la pertinencia de un Reporte de Operación Sospechosa ante la UIF. </w:t>
-      </w:r>
-      <w:r>
-        <w:rPr>
-          <w:rFonts w:ascii="Arial" w:eastAsia="Times New Roman" w:hAnsi="Arial" w:cs="Arial"/>
-          <w:b/>
-          <w:bCs/>
-          <w:kern w:val="0"/>
-          <w:lang w:eastAsia="es-SV"/>
-          <w14:ligatures w14:val="none"/>
-        </w:rPr>
-        <w:t xml:space="preserve">Nivel de riesgo: Alto.</w:t>
+        <w:t xml:space="preserve">Nivel de riesgo: Medio-Alto.</w:t>
       </w:r>
     </w:p>
     <w:p>
@@ -1075,7 +973,7 @@
           <w:lang w:eastAsia="es-SV"/>
           <w14:ligatures w14:val="none"/>
         </w:rPr>
-        <w:t xml:space="preserve">No existe impedimento legal para la utilización de los fondos de la cuenta de Ahorro Premium, ni elementos que justifiquen su inmovilización o restricción.</w:t>
+        <w:t xml:space="preserve">No existe impedimento legal para la utilización de los fondos de la cuenta de Ahorro Premium, ni elementos que justifiquen su inmovilización o restricción unilateral, criterio coincidente con la opinión de la Gerencia Legal y de Cumplimiento Normativo.</w:t>
       </w:r>
     </w:p>
     <w:p>
@@ -1101,7 +999,7 @@
           <w:lang w:eastAsia="es-SV"/>
           <w14:ligatures w14:val="none"/>
         </w:rPr>
-        <w:t xml:space="preserve">Las obligaciones crediticias mantienen un comportamiento normal de pago y continúan respaldadas por los recursos de dicha cuenta.</w:t>
+        <w:t xml:space="preserve">Los créditos prendarios mantienen un comportamiento normal de pago y sus garantías no presentan afectaciones registrales a la fecha.</w:t>
       </w:r>
     </w:p>
     <w:p>
@@ -1153,7 +1051,7 @@
           <w:lang w:eastAsia="es-SV"/>
           <w14:ligatures w14:val="none"/>
         </w:rPr>
-        <w:t xml:space="preserve">Se observa una mayor exposición en materia reputacional, legal, operacional y de lavado de dinero, derivada del proceso penal en curso de conocimiento público.</w:t>
+        <w:t xml:space="preserve">Se observa una mayor exposición en materia reputacional, legal, operacional y de lavado de dinero, derivada del proceso penal en curso de conocimiento público; la Oficialía de Cumplimiento mantiene un perfil Medio-Alto, sujeto a revisión.</w:t>
       </w:r>
     </w:p>
     <w:p>
@@ -1174,7 +1072,7 @@
           <w:lang w:eastAsia="es-SV"/>
           <w14:ligatures w14:val="none"/>
         </w:rPr>
-        <w:t xml:space="preserve">En virtud de lo anterior, resulta razonable mantener la reserva interna aprobada por el Consejo de Administración como mecanismo preventivo de monitoreo reforzado y control institucional, la cual debe considerarse en conjunto con los riesgos identificados dentro del análisis integral.</w:t>
+        <w:t xml:space="preserve">Existen elementos mitigantes como el comportamiento de pago al día, las garantías prendarias vigentes y el respaldo de los fondos de la cuenta Premium, los cuales deben ser considerados en conjunto con los riesgos identificados. En virtud de lo anterior, resulta razonable mantener la reserva interna aprobada por el Consejo de Administración como mecanismo preventivo de monitoreo reforzado y control institucional.</w:t>
       </w:r>
     </w:p>
     <w:p>
@@ -1227,7 +1125,31 @@
           <w:lang w:eastAsia="es-SV"/>
           <w14:ligatures w14:val="none"/>
         </w:rPr>
-        <w:t xml:space="preserve">Derivado del resultado del análisis, consideramos que el Consejo de Administración, como medida mitigante de riesgo, evalúe lo siguiente:</w:t>
+        <w:t xml:space="preserve">Derivado del resultado del análisis y de las opiniones emitidas por las áreas involucradas, consideramos que el Consejo de Administración, como medida mitigante de riesgo, evalúe lo siguiente:</w:t>
+      </w:r>
+    </w:p>
+    <w:p>
+      <w:pPr>
+        <w:keepNext/>
+        <w:spacing w:before="100" w:beforeAutospacing="1" w:after="100" w:afterAutospacing="1" w:line="360" w:lineRule="auto"/>
+        <w:jc w:val="both"/>
+        <w:rPr>
+          <w:rFonts w:ascii="Arial" w:eastAsia="Times New Roman" w:hAnsi="Arial" w:cs="Arial"/>
+          <w:kern w:val="0"/>
+          <w:lang w:eastAsia="es-SV"/>
+          <w14:ligatures w14:val="none"/>
+        </w:rPr>
+      </w:pPr>
+      <w:r>
+        <w:rPr>
+          <w:rFonts w:ascii="Arial" w:eastAsia="Times New Roman" w:hAnsi="Arial" w:cs="Arial"/>
+          <w:b/>
+          <w:bCs/>
+          <w:kern w:val="0"/>
+          <w:lang w:eastAsia="es-SV"/>
+          <w14:ligatures w14:val="none"/>
+        </w:rPr>
+        <w:t xml:space="preserve">Departamento de Administración de Riesgos:</w:t>
       </w:r>
     </w:p>
     <w:p>
@@ -1252,7 +1174,7 @@
           <w:lang w:eastAsia="es-SV"/>
           <w14:ligatures w14:val="none"/>
         </w:rPr>
-        <w:t xml:space="preserve">Mantener la categoría de riesgo crediticio actual del asociado y la reserva interna como medida preventiva de monitoreo y seguimiento.</w:t>
+        <w:t xml:space="preserve">Mantener la categoría de riesgo crediticio actual del asociado, por no existir deterioro financiero conforme a la NCB-022, e incorporar el caso dentro de los esquemas de monitoreo reforzado institucional, en coordinación permanente con la Oficialía de Cumplimiento.</w:t>
       </w:r>
     </w:p>
     <w:p>
@@ -1277,7 +1199,7 @@
           <w:lang w:eastAsia="es-SV"/>
           <w14:ligatures w14:val="none"/>
         </w:rPr>
-        <w:t xml:space="preserve">Permitir la utilización de los fondos de la cuenta Premium para el pago de las obligaciones crediticias vigentes, de conformidad con las autorizaciones contractuales aplicables.</w:t>
+        <w:t xml:space="preserve">Mantener la reserva interna como medida preventiva de monitoreo y seguimiento, y permitir la utilización de los fondos de la cuenta Premium para el pago de las obligaciones crediticias vigentes, de conformidad con las autorizaciones contractuales aplicables.</w:t>
       </w:r>
     </w:p>
     <w:p>
@@ -1302,7 +1224,31 @@
           <w:lang w:eastAsia="es-SV"/>
           <w14:ligatures w14:val="none"/>
         </w:rPr>
-        <w:t xml:space="preserve">Ampliar por medio de Análisis de Riesgo por parte de la Gerencia de Oficialía de Cumplimiento de PLD/FT/FPADM, confirmando la identidad del asociado frente a la información pública, aplicando debida diligencia reforzada y validando el origen de los fondos de la cuenta Premium.</w:t>
+        <w:t xml:space="preserve">Reevaluar el perfil de riesgo cuando existan cambios materiales en la capacidad de pago, comportamiento crediticio o garantías, o cuando se emita una medida formal por autoridad competente.</w:t>
+      </w:r>
+    </w:p>
+    <w:p>
+      <w:pPr>
+        <w:keepNext/>
+        <w:spacing w:before="100" w:beforeAutospacing="1" w:after="100" w:afterAutospacing="1" w:line="360" w:lineRule="auto"/>
+        <w:jc w:val="both"/>
+        <w:rPr>
+          <w:rFonts w:ascii="Arial" w:eastAsia="Times New Roman" w:hAnsi="Arial" w:cs="Arial"/>
+          <w:kern w:val="0"/>
+          <w:lang w:eastAsia="es-SV"/>
+          <w14:ligatures w14:val="none"/>
+        </w:rPr>
+      </w:pPr>
+      <w:r>
+        <w:rPr>
+          <w:rFonts w:ascii="Arial" w:eastAsia="Times New Roman" w:hAnsi="Arial" w:cs="Arial"/>
+          <w:b/>
+          <w:bCs/>
+          <w:kern w:val="0"/>
+          <w:lang w:eastAsia="es-SV"/>
+          <w14:ligatures w14:val="none"/>
+        </w:rPr>
+        <w:t xml:space="preserve">Gerencia Legal y de Cumplimiento Normativo:</w:t>
       </w:r>
     </w:p>
     <w:p>
@@ -1327,7 +1273,7 @@
           <w:lang w:eastAsia="es-SV"/>
           <w14:ligatures w14:val="none"/>
         </w:rPr>
-        <w:t xml:space="preserve">Mantener activas las alertas reputacional (seguimiento de información pública), de cumplimiento (monitoreo de operaciones relevantes), operativa (revisión previa de movimientos extraordinarios, cancelaciones anticipadas o solicitudes especiales) y de actualización de expediente.</w:t>
+        <w:t xml:space="preserve">No inmovilizar, compensar, retener ni restringir de forma unilateral los fondos de la cuenta de Ahorro Premium mientras no exista orden de autoridad competente o causal legal expresamente aplicable.</w:t>
       </w:r>
     </w:p>
     <w:p>
@@ -1352,7 +1298,7 @@
           <w:lang w:eastAsia="es-SV"/>
           <w14:ligatures w14:val="none"/>
         </w:rPr>
-        <w:t xml:space="preserve">Verificar y actualizar los beneficiarios designados en la cuenta de Ahorro Premium.</w:t>
+        <w:t xml:space="preserve">Acatar la instrucción del Consejo de Administración mediante la constitución de la reserva interna de monitoreo y seguimiento reforzado sobre los haberes del asociado.</w:t>
       </w:r>
     </w:p>
     <w:p>
@@ -1377,7 +1323,7 @@
           <w:lang w:eastAsia="es-SV"/>
           <w14:ligatures w14:val="none"/>
         </w:rPr>
-        <w:t xml:space="preserve">Requerir revisión previa de Riesgos, Cumplimiento y la Gerencia Legal para cualquier operación extraordinaria relacionada con los fondos o productos del asociado.</w:t>
+        <w:t xml:space="preserve">Realizar consultas periódicas en el Registro Público de Vehículos Automotores y demás fuentes disponibles, para identificar oportunamente cualquier medida que afecte los bienes dados en garantía o los derechos crediticios de COMÉDICA DE R.L.</w:t>
       </w:r>
     </w:p>
     <w:p>
@@ -1402,7 +1348,446 @@
           <w:lang w:eastAsia="es-SV"/>
           <w14:ligatures w14:val="none"/>
         </w:rPr>
-        <w:t xml:space="preserve">Reevaluar el perfil de riesgo cuando existan cambios materiales en la capacidad de pago, comportamiento crediticio o garantías, o cuando se emita una medida formal por autoridad competente.</w:t>
+        <w:t xml:space="preserve">En caso de notificarse una medida judicial, fiscal o administrativa que afecte los bienes, derechos o haberes del asociado, proceder de inmediato a su cumplimiento y adoptar las acciones necesarias para salvaguardar los intereses de la Institución.</w:t>
+      </w:r>
+    </w:p>
+    <w:p>
+      <w:pPr>
+        <w:numPr>
+          <w:ilvl w:val="0"/>
+          <w:numId w:val="26"/>
+        </w:numPr>
+        <w:spacing w:line="360" w:lineRule="auto"/>
+        <w:jc w:val="both"/>
+        <w:rPr>
+          <w:rFonts w:ascii="Arial" w:eastAsia="Times New Roman" w:hAnsi="Arial" w:cs="Arial"/>
+          <w:kern w:val="0"/>
+          <w:lang w:eastAsia="es-SV"/>
+          <w14:ligatures w14:val="none"/>
+        </w:rPr>
+      </w:pPr>
+      <w:r>
+        <w:rPr>
+          <w:rFonts w:ascii="Arial" w:eastAsia="Times New Roman" w:hAnsi="Arial" w:cs="Arial"/>
+          <w:kern w:val="0"/>
+          <w:lang w:eastAsia="es-SV"/>
+          <w14:ligatures w14:val="none"/>
+        </w:rPr>
+        <w:t xml:space="preserve">Mientras no exista incumplimiento contractual, afectación registral de las garantías o notificación oficial de medidas, no se advierte la necesidad de promover acciones legales adicionales.</w:t>
+      </w:r>
+    </w:p>
+    <w:p>
+      <w:pPr>
+        <w:keepNext/>
+        <w:spacing w:before="100" w:beforeAutospacing="1" w:after="100" w:afterAutospacing="1" w:line="360" w:lineRule="auto"/>
+        <w:jc w:val="both"/>
+        <w:rPr>
+          <w:rFonts w:ascii="Arial" w:eastAsia="Times New Roman" w:hAnsi="Arial" w:cs="Arial"/>
+          <w:kern w:val="0"/>
+          <w:lang w:eastAsia="es-SV"/>
+          <w14:ligatures w14:val="none"/>
+        </w:rPr>
+      </w:pPr>
+      <w:r>
+        <w:rPr>
+          <w:rFonts w:ascii="Arial" w:eastAsia="Times New Roman" w:hAnsi="Arial" w:cs="Arial"/>
+          <w:b/>
+          <w:bCs/>
+          <w:kern w:val="0"/>
+          <w:lang w:eastAsia="es-SV"/>
+          <w14:ligatures w14:val="none"/>
+        </w:rPr>
+        <w:t xml:space="preserve">Oficialía de Cumplimiento:</w:t>
+      </w:r>
+    </w:p>
+    <w:p>
+      <w:pPr>
+        <w:numPr>
+          <w:ilvl w:val="0"/>
+          <w:numId w:val="26"/>
+        </w:numPr>
+        <w:spacing w:line="360" w:lineRule="auto"/>
+        <w:jc w:val="both"/>
+        <w:rPr>
+          <w:rFonts w:ascii="Arial" w:eastAsia="Times New Roman" w:hAnsi="Arial" w:cs="Arial"/>
+          <w:kern w:val="0"/>
+          <w:lang w:eastAsia="es-SV"/>
+          <w14:ligatures w14:val="none"/>
+        </w:rPr>
+      </w:pPr>
+      <w:r>
+        <w:rPr>
+          <w:rFonts w:ascii="Arial" w:eastAsia="Times New Roman" w:hAnsi="Arial" w:cs="Arial"/>
+          <w:kern w:val="0"/>
+          <w:lang w:eastAsia="es-SV"/>
+          <w14:ligatures w14:val="none"/>
+        </w:rPr>
+        <w:t xml:space="preserve">Mantener el perfil de riesgo del asociado en Medio-Alto y efectuar la revisión posterior prevista, valorando su reclasificación conforme a la normativa de prevención de lavado de dinero y financiamiento al terrorismo.</w:t>
+      </w:r>
+    </w:p>
+    <w:p>
+      <w:pPr>
+        <w:numPr>
+          <w:ilvl w:val="0"/>
+          <w:numId w:val="26"/>
+        </w:numPr>
+        <w:spacing w:line="360" w:lineRule="auto"/>
+        <w:jc w:val="both"/>
+        <w:rPr>
+          <w:rFonts w:ascii="Arial" w:eastAsia="Times New Roman" w:hAnsi="Arial" w:cs="Arial"/>
+          <w:kern w:val="0"/>
+          <w:lang w:eastAsia="es-SV"/>
+          <w14:ligatures w14:val="none"/>
+        </w:rPr>
+      </w:pPr>
+      <w:r>
+        <w:rPr>
+          <w:rFonts w:ascii="Arial" w:eastAsia="Times New Roman" w:hAnsi="Arial" w:cs="Arial"/>
+          <w:kern w:val="0"/>
+          <w:lang w:eastAsia="es-SV"/>
+          <w14:ligatures w14:val="none"/>
+        </w:rPr>
+        <w:t xml:space="preserve">Confirmar la identidad del asociado frente a la información pública (descartar homonimia), aplicar debida diligencia reforzada y validar el origen de los fondos de la cuenta Premium.</w:t>
+      </w:r>
+    </w:p>
+    <w:p>
+      <w:pPr>
+        <w:numPr>
+          <w:ilvl w:val="0"/>
+          <w:numId w:val="26"/>
+        </w:numPr>
+        <w:spacing w:line="360" w:lineRule="auto"/>
+        <w:jc w:val="both"/>
+        <w:rPr>
+          <w:rFonts w:ascii="Arial" w:eastAsia="Times New Roman" w:hAnsi="Arial" w:cs="Arial"/>
+          <w:kern w:val="0"/>
+          <w:lang w:eastAsia="es-SV"/>
+          <w14:ligatures w14:val="none"/>
+        </w:rPr>
+      </w:pPr>
+      <w:r>
+        <w:rPr>
+          <w:rFonts w:ascii="Arial" w:eastAsia="Times New Roman" w:hAnsi="Arial" w:cs="Arial"/>
+          <w:kern w:val="0"/>
+          <w:lang w:eastAsia="es-SV"/>
+          <w14:ligatures w14:val="none"/>
+        </w:rPr>
+        <w:t xml:space="preserve">Evaluar, dentro del ámbito de sus competencias, la pertinencia de un Reporte de Operación Sospechosa ante la UIF.</w:t>
+      </w:r>
+    </w:p>
+    <w:p>
+      <w:pPr>
+        <w:keepNext/>
+        <w:spacing w:before="100" w:beforeAutospacing="1" w:after="100" w:afterAutospacing="1" w:line="360" w:lineRule="auto"/>
+        <w:jc w:val="both"/>
+        <w:rPr>
+          <w:rFonts w:ascii="Arial" w:eastAsia="Times New Roman" w:hAnsi="Arial" w:cs="Arial"/>
+          <w:kern w:val="0"/>
+          <w:lang w:eastAsia="es-SV"/>
+          <w14:ligatures w14:val="none"/>
+        </w:rPr>
+      </w:pPr>
+      <w:r>
+        <w:rPr>
+          <w:rFonts w:ascii="Arial" w:eastAsia="Times New Roman" w:hAnsi="Arial" w:cs="Arial"/>
+          <w:b/>
+          <w:bCs/>
+          <w:kern w:val="0"/>
+          <w:lang w:eastAsia="es-SV"/>
+          <w14:ligatures w14:val="none"/>
+        </w:rPr>
+        <w:t xml:space="preserve">Departamento de Soluciones Financieras:</w:t>
+      </w:r>
+    </w:p>
+    <w:p>
+      <w:pPr>
+        <w:numPr>
+          <w:ilvl w:val="0"/>
+          <w:numId w:val="26"/>
+        </w:numPr>
+        <w:spacing w:line="360" w:lineRule="auto"/>
+        <w:jc w:val="both"/>
+        <w:rPr>
+          <w:rFonts w:ascii="Arial" w:eastAsia="Times New Roman" w:hAnsi="Arial" w:cs="Arial"/>
+          <w:kern w:val="0"/>
+          <w:lang w:eastAsia="es-SV"/>
+          <w14:ligatures w14:val="none"/>
+        </w:rPr>
+      </w:pPr>
+      <w:r>
+        <w:rPr>
+          <w:rFonts w:ascii="Arial" w:eastAsia="Times New Roman" w:hAnsi="Arial" w:cs="Arial"/>
+          <w:kern w:val="0"/>
+          <w:lang w:eastAsia="es-SV"/>
+          <w14:ligatures w14:val="none"/>
+        </w:rPr>
+        <w:t xml:space="preserve">Mantener monitoreo permanente y reforzado del comportamiento de pago de ambos créditos prendarios, informando oportunamente cualquier deterioro en la capacidad de cumplimiento del asociado.</w:t>
+      </w:r>
+    </w:p>
+    <w:p>
+      <w:pPr>
+        <w:numPr>
+          <w:ilvl w:val="0"/>
+          <w:numId w:val="26"/>
+        </w:numPr>
+        <w:spacing w:line="360" w:lineRule="auto"/>
+        <w:jc w:val="both"/>
+        <w:rPr>
+          <w:rFonts w:ascii="Arial" w:eastAsia="Times New Roman" w:hAnsi="Arial" w:cs="Arial"/>
+          <w:kern w:val="0"/>
+          <w:lang w:eastAsia="es-SV"/>
+          <w14:ligatures w14:val="none"/>
+        </w:rPr>
+      </w:pPr>
+      <w:r>
+        <w:rPr>
+          <w:rFonts w:ascii="Arial" w:eastAsia="Times New Roman" w:hAnsi="Arial" w:cs="Arial"/>
+          <w:kern w:val="0"/>
+          <w:lang w:eastAsia="es-SV"/>
+          <w14:ligatures w14:val="none"/>
+        </w:rPr>
+        <w:t xml:space="preserve">Verificar y actualizar los beneficiarios designados en la cuenta de Ahorro Premium y la información del expediente.</w:t>
+      </w:r>
+    </w:p>
+    <w:p>
+      <w:pPr>
+        <w:keepNext/>
+        <w:spacing w:before="100" w:beforeAutospacing="1" w:after="100" w:afterAutospacing="1" w:line="360" w:lineRule="auto"/>
+        <w:jc w:val="both"/>
+        <w:rPr>
+          <w:rFonts w:ascii="Arial" w:eastAsia="Times New Roman" w:hAnsi="Arial" w:cs="Arial"/>
+          <w:kern w:val="0"/>
+          <w:lang w:eastAsia="es-SV"/>
+          <w14:ligatures w14:val="none"/>
+        </w:rPr>
+      </w:pPr>
+      <w:r>
+        <w:rPr>
+          <w:rFonts w:ascii="Arial" w:eastAsia="Times New Roman" w:hAnsi="Arial" w:cs="Arial"/>
+          <w:b/>
+          <w:bCs/>
+          <w:kern w:val="0"/>
+          <w:lang w:eastAsia="es-SV"/>
+          <w14:ligatures w14:val="none"/>
+        </w:rPr>
+        <w:t xml:space="preserve">Alertas institucionales a mantener activas:</w:t>
+      </w:r>
+    </w:p>
+    <w:p>
+      <w:pPr>
+        <w:numPr>
+          <w:ilvl w:val="0"/>
+          <w:numId w:val="26"/>
+        </w:numPr>
+        <w:spacing w:line="360" w:lineRule="auto"/>
+        <w:jc w:val="both"/>
+        <w:rPr>
+          <w:rFonts w:ascii="Arial" w:eastAsia="Times New Roman" w:hAnsi="Arial" w:cs="Arial"/>
+          <w:kern w:val="0"/>
+          <w:lang w:eastAsia="es-SV"/>
+          <w14:ligatures w14:val="none"/>
+        </w:rPr>
+      </w:pPr>
+      <w:r>
+        <w:rPr>
+          <w:rFonts w:ascii="Arial" w:eastAsia="Times New Roman" w:hAnsi="Arial" w:cs="Arial"/>
+          <w:b/>
+          <w:bCs/>
+          <w:kern w:val="0"/>
+          <w:lang w:eastAsia="es-SV"/>
+          <w14:ligatures w14:val="none"/>
+        </w:rPr>
+        <w:t xml:space="preserve">Alerta reputacional: </w:t>
+      </w:r>
+      <w:r>
+        <w:rPr>
+          <w:rFonts w:ascii="Arial" w:eastAsia="Times New Roman" w:hAnsi="Arial" w:cs="Arial"/>
+          <w:kern w:val="0"/>
+          <w:lang w:eastAsia="es-SV"/>
+          <w14:ligatures w14:val="none"/>
+        </w:rPr>
+        <w:t xml:space="preserve">seguimiento permanente de información pública y del avance del proceso penal relacionado con el asociado.</w:t>
+      </w:r>
+    </w:p>
+    <w:p>
+      <w:pPr>
+        <w:numPr>
+          <w:ilvl w:val="0"/>
+          <w:numId w:val="26"/>
+        </w:numPr>
+        <w:spacing w:line="360" w:lineRule="auto"/>
+        <w:jc w:val="both"/>
+        <w:rPr>
+          <w:rFonts w:ascii="Arial" w:eastAsia="Times New Roman" w:hAnsi="Arial" w:cs="Arial"/>
+          <w:kern w:val="0"/>
+          <w:lang w:eastAsia="es-SV"/>
+          <w14:ligatures w14:val="none"/>
+        </w:rPr>
+      </w:pPr>
+      <w:r>
+        <w:rPr>
+          <w:rFonts w:ascii="Arial" w:eastAsia="Times New Roman" w:hAnsi="Arial" w:cs="Arial"/>
+          <w:b/>
+          <w:bCs/>
+          <w:kern w:val="0"/>
+          <w:lang w:eastAsia="es-SV"/>
+          <w14:ligatures w14:val="none"/>
+        </w:rPr>
+        <w:t xml:space="preserve">Alerta de cumplimiento: </w:t>
+      </w:r>
+      <w:r>
+        <w:rPr>
+          <w:rFonts w:ascii="Arial" w:eastAsia="Times New Roman" w:hAnsi="Arial" w:cs="Arial"/>
+          <w:kern w:val="0"/>
+          <w:lang w:eastAsia="es-SV"/>
+          <w14:ligatures w14:val="none"/>
+        </w:rPr>
+        <w:t xml:space="preserve">debida diligencia reforzada y monitoreo de operaciones relevantes por parte de la Oficialía de Cumplimiento.</w:t>
+      </w:r>
+    </w:p>
+    <w:p>
+      <w:pPr>
+        <w:numPr>
+          <w:ilvl w:val="0"/>
+          <w:numId w:val="26"/>
+        </w:numPr>
+        <w:spacing w:line="360" w:lineRule="auto"/>
+        <w:jc w:val="both"/>
+        <w:rPr>
+          <w:rFonts w:ascii="Arial" w:eastAsia="Times New Roman" w:hAnsi="Arial" w:cs="Arial"/>
+          <w:kern w:val="0"/>
+          <w:lang w:eastAsia="es-SV"/>
+          <w14:ligatures w14:val="none"/>
+        </w:rPr>
+      </w:pPr>
+      <w:r>
+        <w:rPr>
+          <w:rFonts w:ascii="Arial" w:eastAsia="Times New Roman" w:hAnsi="Arial" w:cs="Arial"/>
+          <w:b/>
+          <w:bCs/>
+          <w:kern w:val="0"/>
+          <w:lang w:eastAsia="es-SV"/>
+          <w14:ligatures w14:val="none"/>
+        </w:rPr>
+        <w:t xml:space="preserve">Alerta de control sobre la cuenta de Ahorro Premium: </w:t>
+      </w:r>
+      <w:r>
+        <w:rPr>
+          <w:rFonts w:ascii="Arial" w:eastAsia="Times New Roman" w:hAnsi="Arial" w:cs="Arial"/>
+          <w:kern w:val="0"/>
+          <w:lang w:eastAsia="es-SV"/>
+          <w14:ligatures w14:val="none"/>
+        </w:rPr>
+        <w:t xml:space="preserve">toda solicitud de cancelación anticipada, retiro extraordinario o transacción que se aparte del comportamiento histórico deberá ser revisada previamente por Riesgos, Cumplimiento y la Gerencia Legal antes de su ejecución.</w:t>
+      </w:r>
+    </w:p>
+    <w:p>
+      <w:pPr>
+        <w:numPr>
+          <w:ilvl w:val="0"/>
+          <w:numId w:val="26"/>
+        </w:numPr>
+        <w:spacing w:line="360" w:lineRule="auto"/>
+        <w:jc w:val="both"/>
+        <w:rPr>
+          <w:rFonts w:ascii="Arial" w:eastAsia="Times New Roman" w:hAnsi="Arial" w:cs="Arial"/>
+          <w:kern w:val="0"/>
+          <w:lang w:eastAsia="es-SV"/>
+          <w14:ligatures w14:val="none"/>
+        </w:rPr>
+      </w:pPr>
+      <w:r>
+        <w:rPr>
+          <w:rFonts w:ascii="Arial" w:eastAsia="Times New Roman" w:hAnsi="Arial" w:cs="Arial"/>
+          <w:b/>
+          <w:bCs/>
+          <w:kern w:val="0"/>
+          <w:lang w:eastAsia="es-SV"/>
+          <w14:ligatures w14:val="none"/>
+        </w:rPr>
+        <w:t xml:space="preserve">Alerta de garantías: </w:t>
+      </w:r>
+      <w:r>
+        <w:rPr>
+          <w:rFonts w:ascii="Arial" w:eastAsia="Times New Roman" w:hAnsi="Arial" w:cs="Arial"/>
+          <w:kern w:val="0"/>
+          <w:lang w:eastAsia="es-SV"/>
+          <w14:ligatures w14:val="none"/>
+        </w:rPr>
+        <w:t xml:space="preserve">consulta periódica en el Registro Público de Vehículos Automotores para detectar anotaciones preventivas, medidas cautelares, secuestro o decomiso sobre los bienes dados en prenda.</w:t>
+      </w:r>
+    </w:p>
+    <w:p>
+      <w:pPr>
+        <w:numPr>
+          <w:ilvl w:val="0"/>
+          <w:numId w:val="26"/>
+        </w:numPr>
+        <w:spacing w:line="360" w:lineRule="auto"/>
+        <w:jc w:val="both"/>
+        <w:rPr>
+          <w:rFonts w:ascii="Arial" w:eastAsia="Times New Roman" w:hAnsi="Arial" w:cs="Arial"/>
+          <w:kern w:val="0"/>
+          <w:lang w:eastAsia="es-SV"/>
+          <w14:ligatures w14:val="none"/>
+        </w:rPr>
+      </w:pPr>
+      <w:r>
+        <w:rPr>
+          <w:rFonts w:ascii="Arial" w:eastAsia="Times New Roman" w:hAnsi="Arial" w:cs="Arial"/>
+          <w:b/>
+          <w:bCs/>
+          <w:kern w:val="0"/>
+          <w:lang w:eastAsia="es-SV"/>
+          <w14:ligatures w14:val="none"/>
+        </w:rPr>
+        <w:t xml:space="preserve">Alerta crediticia: </w:t>
+      </w:r>
+      <w:r>
+        <w:rPr>
+          <w:rFonts w:ascii="Arial" w:eastAsia="Times New Roman" w:hAnsi="Arial" w:cs="Arial"/>
+          <w:kern w:val="0"/>
+          <w:lang w:eastAsia="es-SV"/>
+          <w14:ligatures w14:val="none"/>
+        </w:rPr>
+        <w:t xml:space="preserve">monitoreo reforzado del comportamiento de pago de ambos créditos prendarios.</w:t>
+      </w:r>
+    </w:p>
+    <w:p>
+      <w:pPr>
+        <w:keepNext/>
+        <w:numPr>
+          <w:ilvl w:val="0"/>
+          <w:numId w:val="26"/>
+        </w:numPr>
+        <w:spacing w:line="360" w:lineRule="auto"/>
+        <w:jc w:val="both"/>
+        <w:rPr>
+          <w:rFonts w:ascii="Arial" w:eastAsia="Times New Roman" w:hAnsi="Arial" w:cs="Arial"/>
+          <w:kern w:val="0"/>
+          <w:lang w:eastAsia="es-SV"/>
+          <w14:ligatures w14:val="none"/>
+        </w:rPr>
+      </w:pPr>
+      <w:r>
+        <w:rPr>
+          <w:rFonts w:ascii="Arial" w:eastAsia="Times New Roman" w:hAnsi="Arial" w:cs="Arial"/>
+          <w:b/>
+          <w:bCs/>
+          <w:kern w:val="0"/>
+          <w:lang w:eastAsia="es-SV"/>
+          <w14:ligatures w14:val="none"/>
+        </w:rPr>
+        <w:t xml:space="preserve">Alerta de actualización de expediente: </w:t>
+      </w:r>
+      <w:r>
+        <w:rPr>
+          <w:rFonts w:ascii="Arial" w:eastAsia="Times New Roman" w:hAnsi="Arial" w:cs="Arial"/>
+          <w:kern w:val="0"/>
+          <w:lang w:eastAsia="es-SV"/>
+          <w14:ligatures w14:val="none"/>
+        </w:rPr>
+        <w:t xml:space="preserve">validación periódica de la información financiera, económica y de beneficiarios del asociado.</w:t>
       </w:r>
     </w:p>
     <w:p>

</xml_diff>

<commit_message>
DAR-2026-56: corregir a tres créditos (dos prendarios y uno hipotecario)
Co-Authored-By: Claude Opus 5.5 <noreply@anthropic.com>
Claude-Session: https://claude.ai/code/session_019v6pd36FfCTKWdmbaW6yXF
</commit_message>
<xml_diff>
--- a/DAR-2026-56_Opinion_Jonnathan_Jacobo_Marroquin.docx
+++ b/DAR-2026-56_Opinion_Jonnathan_Jacobo_Marroquin.docx
@@ -341,7 +341,7 @@
           <w:lang w:eastAsia="es-SV"/>
           <w14:ligatures w14:val="none"/>
         </w:rPr>
-        <w:t xml:space="preserve">El asociado mantiene dos créditos con garantía prendaria a favor de COMÉDICA DE R.L., los cuales se encuentran vigentes y al día, con pagos realizados mediante cargos y transferencias provenientes de la cuenta Premium, cuyos recursos continúan constituyendo respaldo para el cumplimiento de dichas obligaciones.</w:t>
+        <w:t xml:space="preserve">El asociado mantiene tres créditos a favor de COMÉDICA DE R.L.: dos con garantía prendaria y uno con garantía hipotecaria, los cuales se encuentran vigentes y al día, con pagos realizados mediante cargos y transferencias provenientes de la cuenta Premium, cuyos recursos continúan constituyendo respaldo para el cumplimiento de dichas obligaciones.</w:t>
       </w:r>
     </w:p>
     <w:p>
@@ -621,7 +621,7 @@
           <w:lang w:eastAsia="es-SV"/>
           <w14:ligatures w14:val="none"/>
         </w:rPr>
-        <w:t xml:space="preserve">No se identifican evidencias de deterioro en la capacidad de pago, incumplimiento de obligaciones, insuficiencia de garantías o factores que afecten la recuperación de los créditos; las garantías prendarias conservan su eficacia jurídica según la Gerencia Legal. De conformidad con la NCB-022, la situación analizada no constituye por sí misma una causal de reclasificación de la categoría de riesgo crediticio. No obstante, la detención provisional reportada podría afectar la fuente de ingresos del asociado, por lo que la atención de las obligaciones depende actualmente de los fondos de la cuenta Premium. </w:t>
+        <w:t xml:space="preserve">No se identifican evidencias de deterioro en la capacidad de pago, incumplimiento de obligaciones, insuficiencia de garantías o factores que afecten la recuperación de los créditos; las garantías prendarias conservan su eficacia jurídica según la Gerencia Legal y el crédito hipotecario se encuentra respaldado por el inmueble otorgado en garantía. De conformidad con la NCB-022, la situación analizada no constituye por sí misma una causal de reclasificación de la categoría de riesgo crediticio. No obstante, la detención provisional reportada podría afectar la fuente de ingresos del asociado, por lo que la atención de las obligaciones depende actualmente de los fondos de la cuenta Premium. </w:t>
       </w:r>
       <w:r>
         <w:rPr>
@@ -807,7 +807,7 @@
           <w:lang w:eastAsia="es-SV"/>
           <w14:ligatures w14:val="none"/>
         </w:rPr>
-        <w:t xml:space="preserve">La aplicación de restricciones sobre los fondos sin orden de autoridad competente podría generar contingencias legales para la Institución. Asimismo, los bienes dados en garantía prendaria podrían verse afectados en caso de decretarse anotaciones preventivas, secuestro, decomiso o extinción de dominio, en cuyo caso la Institución deberá acatar la medida de forma inmediata y salvaguardar su derecho preferente. En el ámbito operativo, existe riesgo de errores en la ejecución de instrucciones o aplicación indebida de restricciones, considerando que la reserva interna no constituye una restricción legal. </w:t>
+        <w:t xml:space="preserve">La aplicación de restricciones sobre los fondos sin orden de autoridad competente podría generar contingencias legales para la Institución. Asimismo, los bienes dados en garantía prendaria e hipotecaria podrían verse afectados en caso de decretarse anotaciones preventivas, secuestro, decomiso o extinción de dominio, en cuyo caso la Institución deberá acatar la medida de forma inmediata y salvaguardar su derecho preferente. En el ámbito operativo, existe riesgo de errores en la ejecución de instrucciones o aplicación indebida de restricciones, considerando que la reserva interna no constituye una restricción legal. </w:t>
       </w:r>
       <w:r>
         <w:rPr>
@@ -999,7 +999,7 @@
           <w:lang w:eastAsia="es-SV"/>
           <w14:ligatures w14:val="none"/>
         </w:rPr>
-        <w:t xml:space="preserve">Los créditos prendarios mantienen un comportamiento normal de pago y sus garantías no presentan afectaciones registrales a la fecha.</w:t>
+        <w:t xml:space="preserve">Los tres créditos (dos prendarios y uno hipotecario) mantienen un comportamiento normal de pago y, según la Gerencia Legal, las garantías prendarias no presentan afectaciones registrales a la fecha.</w:t>
       </w:r>
     </w:p>
     <w:p>
@@ -1072,7 +1072,7 @@
           <w:lang w:eastAsia="es-SV"/>
           <w14:ligatures w14:val="none"/>
         </w:rPr>
-        <w:t xml:space="preserve">Existen elementos mitigantes como el comportamiento de pago al día, las garantías prendarias vigentes y el respaldo de los fondos de la cuenta Premium, los cuales deben ser considerados en conjunto con los riesgos identificados. En virtud de lo anterior, resulta razonable mantener la reserva interna aprobada por el Consejo de Administración como mecanismo preventivo de monitoreo reforzado y control institucional.</w:t>
+        <w:t xml:space="preserve">Existen elementos mitigantes como el comportamiento de pago al día, las garantías prendarias e hipotecaria vigentes y el respaldo de los fondos de la cuenta Premium, los cuales deben ser considerados en conjunto con los riesgos identificados. En virtud de lo anterior, resulta razonable mantener la reserva interna aprobada por el Consejo de Administración como mecanismo preventivo de monitoreo reforzado y control institucional.</w:t>
       </w:r>
     </w:p>
     <w:p>
@@ -1323,7 +1323,7 @@
           <w:lang w:eastAsia="es-SV"/>
           <w14:ligatures w14:val="none"/>
         </w:rPr>
-        <w:t xml:space="preserve">Realizar consultas periódicas en el Registro Público de Vehículos Automotores y demás fuentes disponibles, para identificar oportunamente cualquier medida que afecte los bienes dados en garantía o los derechos crediticios de COMÉDICA DE R.L.</w:t>
+        <w:t xml:space="preserve">Realizar consultas periódicas en el Registro Público de Vehículos Automotores, en el Registro de la Propiedad Raíz e Hipotecas del CNR y demás fuentes disponibles, para identificar oportunamente cualquier medida que afecte los bienes dados en garantía o los derechos crediticios de COMÉDICA DE R.L.</w:t>
       </w:r>
     </w:p>
     <w:p>
@@ -1521,7 +1521,7 @@
           <w:lang w:eastAsia="es-SV"/>
           <w14:ligatures w14:val="none"/>
         </w:rPr>
-        <w:t xml:space="preserve">Mantener monitoreo permanente y reforzado del comportamiento de pago de ambos créditos prendarios, informando oportunamente cualquier deterioro en la capacidad de cumplimiento del asociado.</w:t>
+        <w:t xml:space="preserve">Solicitar a la Gerencia Legal y de Cumplimiento Normativo ampliar su opinión jurídica sobre la garantía hipotecaria, verificando su vigencia e inscripción y que no existan anotaciones o restricciones registrales sobre el inmueble.</w:t>
       </w:r>
     </w:p>
     <w:p>
@@ -1546,31 +1546,7 @@
           <w:lang w:eastAsia="es-SV"/>
           <w14:ligatures w14:val="none"/>
         </w:rPr>
-        <w:t xml:space="preserve">Verificar y actualizar los beneficiarios designados en la cuenta de Ahorro Premium y la información del expediente.</w:t>
-      </w:r>
-    </w:p>
-    <w:p>
-      <w:pPr>
-        <w:keepNext/>
-        <w:spacing w:before="100" w:beforeAutospacing="1" w:after="100" w:afterAutospacing="1" w:line="360" w:lineRule="auto"/>
-        <w:jc w:val="both"/>
-        <w:rPr>
-          <w:rFonts w:ascii="Arial" w:eastAsia="Times New Roman" w:hAnsi="Arial" w:cs="Arial"/>
-          <w:kern w:val="0"/>
-          <w:lang w:eastAsia="es-SV"/>
-          <w14:ligatures w14:val="none"/>
-        </w:rPr>
-      </w:pPr>
-      <w:r>
-        <w:rPr>
-          <w:rFonts w:ascii="Arial" w:eastAsia="Times New Roman" w:hAnsi="Arial" w:cs="Arial"/>
-          <w:b/>
-          <w:bCs/>
-          <w:kern w:val="0"/>
-          <w:lang w:eastAsia="es-SV"/>
-          <w14:ligatures w14:val="none"/>
-        </w:rPr>
-        <w:t xml:space="preserve">Alertas institucionales a mantener activas:</w:t>
+        <w:t xml:space="preserve">Mantener monitoreo permanente y reforzado del comportamiento de pago de los tres créditos (dos prendarios y uno hipotecario), informando oportunamente cualquier deterioro en la capacidad de cumplimiento del asociado.</w:t>
       </w:r>
     </w:p>
     <w:p>
@@ -1591,22 +1567,35 @@
       <w:r>
         <w:rPr>
           <w:rFonts w:ascii="Arial" w:eastAsia="Times New Roman" w:hAnsi="Arial" w:cs="Arial"/>
+          <w:kern w:val="0"/>
+          <w:lang w:eastAsia="es-SV"/>
+          <w14:ligatures w14:val="none"/>
+        </w:rPr>
+        <w:t xml:space="preserve">Verificar y actualizar los beneficiarios designados en la cuenta de Ahorro Premium y la información del expediente.</w:t>
+      </w:r>
+    </w:p>
+    <w:p>
+      <w:pPr>
+        <w:keepNext/>
+        <w:spacing w:before="100" w:beforeAutospacing="1" w:after="100" w:afterAutospacing="1" w:line="360" w:lineRule="auto"/>
+        <w:jc w:val="both"/>
+        <w:rPr>
+          <w:rFonts w:ascii="Arial" w:eastAsia="Times New Roman" w:hAnsi="Arial" w:cs="Arial"/>
+          <w:kern w:val="0"/>
+          <w:lang w:eastAsia="es-SV"/>
+          <w14:ligatures w14:val="none"/>
+        </w:rPr>
+      </w:pPr>
+      <w:r>
+        <w:rPr>
+          <w:rFonts w:ascii="Arial" w:eastAsia="Times New Roman" w:hAnsi="Arial" w:cs="Arial"/>
           <w:b/>
           <w:bCs/>
           <w:kern w:val="0"/>
           <w:lang w:eastAsia="es-SV"/>
           <w14:ligatures w14:val="none"/>
         </w:rPr>
-        <w:t xml:space="preserve">Alerta reputacional: </w:t>
-      </w:r>
-      <w:r>
-        <w:rPr>
-          <w:rFonts w:ascii="Arial" w:eastAsia="Times New Roman" w:hAnsi="Arial" w:cs="Arial"/>
-          <w:kern w:val="0"/>
-          <w:lang w:eastAsia="es-SV"/>
-          <w14:ligatures w14:val="none"/>
-        </w:rPr>
-        <w:t xml:space="preserve">seguimiento permanente de información pública y del avance del proceso penal relacionado con el asociado.</w:t>
+        <w:t xml:space="preserve">Alertas institucionales a mantener activas:</w:t>
       </w:r>
     </w:p>
     <w:p>
@@ -1633,16 +1622,16 @@
           <w:lang w:eastAsia="es-SV"/>
           <w14:ligatures w14:val="none"/>
         </w:rPr>
-        <w:t xml:space="preserve">Alerta de cumplimiento: </w:t>
-      </w:r>
-      <w:r>
-        <w:rPr>
-          <w:rFonts w:ascii="Arial" w:eastAsia="Times New Roman" w:hAnsi="Arial" w:cs="Arial"/>
-          <w:kern w:val="0"/>
-          <w:lang w:eastAsia="es-SV"/>
-          <w14:ligatures w14:val="none"/>
-        </w:rPr>
-        <w:t xml:space="preserve">debida diligencia reforzada y monitoreo de operaciones relevantes por parte de la Oficialía de Cumplimiento.</w:t>
+        <w:t xml:space="preserve">Alerta reputacional: </w:t>
+      </w:r>
+      <w:r>
+        <w:rPr>
+          <w:rFonts w:ascii="Arial" w:eastAsia="Times New Roman" w:hAnsi="Arial" w:cs="Arial"/>
+          <w:kern w:val="0"/>
+          <w:lang w:eastAsia="es-SV"/>
+          <w14:ligatures w14:val="none"/>
+        </w:rPr>
+        <w:t xml:space="preserve">seguimiento permanente de información pública y del avance del proceso penal relacionado con el asociado.</w:t>
       </w:r>
     </w:p>
     <w:p>
@@ -1669,16 +1658,16 @@
           <w:lang w:eastAsia="es-SV"/>
           <w14:ligatures w14:val="none"/>
         </w:rPr>
-        <w:t xml:space="preserve">Alerta de control sobre la cuenta de Ahorro Premium: </w:t>
-      </w:r>
-      <w:r>
-        <w:rPr>
-          <w:rFonts w:ascii="Arial" w:eastAsia="Times New Roman" w:hAnsi="Arial" w:cs="Arial"/>
-          <w:kern w:val="0"/>
-          <w:lang w:eastAsia="es-SV"/>
-          <w14:ligatures w14:val="none"/>
-        </w:rPr>
-        <w:t xml:space="preserve">toda solicitud de cancelación anticipada, retiro extraordinario o transacción que se aparte del comportamiento histórico deberá ser revisada previamente por Riesgos, Cumplimiento y la Gerencia Legal antes de su ejecución.</w:t>
+        <w:t xml:space="preserve">Alerta de cumplimiento: </w:t>
+      </w:r>
+      <w:r>
+        <w:rPr>
+          <w:rFonts w:ascii="Arial" w:eastAsia="Times New Roman" w:hAnsi="Arial" w:cs="Arial"/>
+          <w:kern w:val="0"/>
+          <w:lang w:eastAsia="es-SV"/>
+          <w14:ligatures w14:val="none"/>
+        </w:rPr>
+        <w:t xml:space="preserve">debida diligencia reforzada y monitoreo de operaciones relevantes por parte de la Oficialía de Cumplimiento.</w:t>
       </w:r>
     </w:p>
     <w:p>
@@ -1705,16 +1694,16 @@
           <w:lang w:eastAsia="es-SV"/>
           <w14:ligatures w14:val="none"/>
         </w:rPr>
-        <w:t xml:space="preserve">Alerta de garantías: </w:t>
-      </w:r>
-      <w:r>
-        <w:rPr>
-          <w:rFonts w:ascii="Arial" w:eastAsia="Times New Roman" w:hAnsi="Arial" w:cs="Arial"/>
-          <w:kern w:val="0"/>
-          <w:lang w:eastAsia="es-SV"/>
-          <w14:ligatures w14:val="none"/>
-        </w:rPr>
-        <w:t xml:space="preserve">consulta periódica en el Registro Público de Vehículos Automotores para detectar anotaciones preventivas, medidas cautelares, secuestro o decomiso sobre los bienes dados en prenda.</w:t>
+        <w:t xml:space="preserve">Alerta de control sobre la cuenta de Ahorro Premium: </w:t>
+      </w:r>
+      <w:r>
+        <w:rPr>
+          <w:rFonts w:ascii="Arial" w:eastAsia="Times New Roman" w:hAnsi="Arial" w:cs="Arial"/>
+          <w:kern w:val="0"/>
+          <w:lang w:eastAsia="es-SV"/>
+          <w14:ligatures w14:val="none"/>
+        </w:rPr>
+        <w:t xml:space="preserve">toda solicitud de cancelación anticipada, retiro extraordinario o transacción que se aparte del comportamiento histórico deberá ser revisada previamente por Riesgos, Cumplimiento y la Gerencia Legal antes de su ejecución.</w:t>
       </w:r>
     </w:p>
     <w:p>
@@ -1741,6 +1730,42 @@
           <w:lang w:eastAsia="es-SV"/>
           <w14:ligatures w14:val="none"/>
         </w:rPr>
+        <w:t xml:space="preserve">Alerta de garantías: </w:t>
+      </w:r>
+      <w:r>
+        <w:rPr>
+          <w:rFonts w:ascii="Arial" w:eastAsia="Times New Roman" w:hAnsi="Arial" w:cs="Arial"/>
+          <w:kern w:val="0"/>
+          <w:lang w:eastAsia="es-SV"/>
+          <w14:ligatures w14:val="none"/>
+        </w:rPr>
+        <w:t xml:space="preserve">consulta periódica en el Registro Público de Vehículos Automotores y en el Registro de la Propiedad Raíz e Hipotecas del CNR para detectar anotaciones preventivas, medidas cautelares, secuestro, embargo o decomiso sobre los bienes dados en prenda e hipoteca.</w:t>
+      </w:r>
+    </w:p>
+    <w:p>
+      <w:pPr>
+        <w:numPr>
+          <w:ilvl w:val="0"/>
+          <w:numId w:val="26"/>
+        </w:numPr>
+        <w:spacing w:line="360" w:lineRule="auto"/>
+        <w:jc w:val="both"/>
+        <w:rPr>
+          <w:rFonts w:ascii="Arial" w:eastAsia="Times New Roman" w:hAnsi="Arial" w:cs="Arial"/>
+          <w:kern w:val="0"/>
+          <w:lang w:eastAsia="es-SV"/>
+          <w14:ligatures w14:val="none"/>
+        </w:rPr>
+      </w:pPr>
+      <w:r>
+        <w:rPr>
+          <w:rFonts w:ascii="Arial" w:eastAsia="Times New Roman" w:hAnsi="Arial" w:cs="Arial"/>
+          <w:b/>
+          <w:bCs/>
+          <w:kern w:val="0"/>
+          <w:lang w:eastAsia="es-SV"/>
+          <w14:ligatures w14:val="none"/>
+        </w:rPr>
         <w:t xml:space="preserve">Alerta crediticia: </w:t>
       </w:r>
       <w:r>
@@ -1750,7 +1775,7 @@
           <w:lang w:eastAsia="es-SV"/>
           <w14:ligatures w14:val="none"/>
         </w:rPr>
-        <w:t xml:space="preserve">monitoreo reforzado del comportamiento de pago de ambos créditos prendarios.</w:t>
+        <w:t xml:space="preserve">monitoreo reforzado del comportamiento de pago de los tres créditos (dos prendarios y uno hipotecario).</w:t>
       </w:r>
     </w:p>
     <w:p>

</xml_diff>

<commit_message>
DAR-2026-56: incorporar proyección de cobertura de pagos con fondos de la cuenta Premium
Co-Authored-By: Claude Opus 5.5 <noreply@anthropic.com>
Claude-Session: https://claude.ai/code/session_019v6pd36FfCTKWdmbaW6yXF
</commit_message>
<xml_diff>
--- a/DAR-2026-56_Opinion_Jonnathan_Jacobo_Marroquin.docx
+++ b/DAR-2026-56_Opinion_Jonnathan_Jacobo_Marroquin.docx
@@ -341,7 +341,7 @@
           <w:lang w:eastAsia="es-SV"/>
           <w14:ligatures w14:val="none"/>
         </w:rPr>
-        <w:t xml:space="preserve">El asociado mantiene tres créditos a favor de COMÉDICA DE R.L.: dos con garantía prendaria y uno con garantía hipotecaria, los cuales se encuentran vigentes y al día, con pagos realizados mediante cargos y transferencias provenientes de la cuenta Premium, cuyos recursos continúan constituyendo respaldo para el cumplimiento de dichas obligaciones.</w:t>
+        <w:t xml:space="preserve">El asociado mantiene tres créditos a favor de COMÉDICA DE R.L.: dos con garantía prendaria y uno con garantía hipotecaria, los cuales se encuentran vigentes y al día debido a que los abonos son realizados mensualmente mediante transferencias automáticas con cargo a su cuenta de Ahorro Premium.</w:t>
       </w:r>
     </w:p>
     <w:p>
@@ -384,16 +384,16 @@
           <w:lang w:eastAsia="es-SV"/>
           <w14:ligatures w14:val="none"/>
         </w:rPr>
-        <w:t xml:space="preserve">Investigación del caso: </w:t>
-      </w:r>
-      <w:r>
-        <w:rPr>
-          <w:rFonts w:ascii="Arial" w:eastAsia="Times New Roman" w:hAnsi="Arial" w:cs="Arial"/>
-          <w:kern w:val="0"/>
-          <w:lang w:eastAsia="es-SV"/>
-          <w14:ligatures w14:val="none"/>
-        </w:rPr>
-        <w:t xml:space="preserve">de acuerdo con información de carácter público (comunicados de la Fiscalía General de la República e informes de medios nacionales como Diario El Salvador, Diario1 e Infobae), el 13 de febrero de 2026 la FGR y la PNC ejecutaron un operativo para desarticular una estructura dedicada al narcotráfico internacional, con vínculos en Guatemala, en el cual figura entre las personas capturadas una persona identificada como Jonnathan Jacobo Marroquín. Según la FGR, los imputados serían procesados por los delitos de tráfico ilícito, cooperación en el delito de tráfico de drogas, agrupaciones ilícitas, cohecho activo y cohecho impropio; en los allanamientos se reportó el decomiso de drogas, medicamentos controlados, dinero en efectivo y vehículos.</w:t>
+        <w:t xml:space="preserve">Proyección de cobertura de pagos: </w:t>
+      </w:r>
+      <w:r>
+        <w:rPr>
+          <w:rFonts w:ascii="Arial" w:eastAsia="Times New Roman" w:hAnsi="Arial" w:cs="Arial"/>
+          <w:kern w:val="0"/>
+          <w:lang w:eastAsia="es-SV"/>
+          <w14:ligatures w14:val="none"/>
+        </w:rPr>
+        <w:t xml:space="preserve">el saldo disponible de la cuenta Premium para continuar con las transferencias a sus préstamos asciende a US$41,866.92, del cual se realizan descuentos mensuales por un total de US$2,370.00. Manteniéndose las condiciones actuales, los fondos existentes serían suficientes para cubrir aproximadamente 17 meses de dichas obligaciones, por lo que, de continuar esta tendencia, las referencias crediticias del asociado presentarían morosidad a partir del cierre de marzo de 2028, siendo necesario hacer uso de la garantía hipotecaria para recuperar el saldo insoluto de sus deudas.</w:t>
       </w:r>
     </w:p>
     <w:p>
@@ -430,11 +430,22 @@
       <w:r>
         <w:rPr>
           <w:rFonts w:ascii="Arial" w:eastAsia="Times New Roman" w:hAnsi="Arial" w:cs="Arial"/>
-          <w:kern w:val="0"/>
-          <w:lang w:eastAsia="es-SV"/>
-          <w14:ligatures w14:val="none"/>
-        </w:rPr>
-        <w:t xml:space="preserve">El 04 de marzo de 2026, la FGR informó que se decretó instrucción formal con detención provisional contra los integrantes de dicha estructura, por lo que el proceso penal se encuentra en curso y no existe, a la fecha, sentencia condenatoria conocida. Las fuentes públicas no detallan el rol específico atribuido a la persona señalada, por lo que es necesario confirmar la identidad (número de DUI) para descartar un caso de homonimia.</w:t>
+          <w:b/>
+          <w:bCs/>
+          <w:kern w:val="0"/>
+          <w:lang w:eastAsia="es-SV"/>
+          <w14:ligatures w14:val="none"/>
+        </w:rPr>
+        <w:t xml:space="preserve">Investigación del caso: </w:t>
+      </w:r>
+      <w:r>
+        <w:rPr>
+          <w:rFonts w:ascii="Arial" w:eastAsia="Times New Roman" w:hAnsi="Arial" w:cs="Arial"/>
+          <w:kern w:val="0"/>
+          <w:lang w:eastAsia="es-SV"/>
+          <w14:ligatures w14:val="none"/>
+        </w:rPr>
+        <w:t xml:space="preserve">de acuerdo con información de carácter público (comunicados de la Fiscalía General de la República e informes de medios nacionales como Diario El Salvador, Diario1 e Infobae), el 13 de febrero de 2026 la FGR y la PNC ejecutaron un operativo para desarticular una estructura dedicada al narcotráfico internacional, con vínculos en Guatemala, en el cual figura entre las personas capturadas una persona identificada como Jonnathan Jacobo Marroquín. Según la FGR, los imputados serían procesados por los delitos de tráfico ilícito, cooperación en el delito de tráfico de drogas, agrupaciones ilícitas, cohecho activo y cohecho impropio; en los allanamientos se reportó el decomiso de drogas, medicamentos controlados, dinero en efectivo y vehículos.</w:t>
       </w:r>
     </w:p>
     <w:p>
@@ -471,22 +482,11 @@
       <w:r>
         <w:rPr>
           <w:rFonts w:ascii="Arial" w:eastAsia="Times New Roman" w:hAnsi="Arial" w:cs="Arial"/>
-          <w:b/>
-          <w:bCs/>
-          <w:kern w:val="0"/>
-          <w:lang w:eastAsia="es-SV"/>
-          <w14:ligatures w14:val="none"/>
-        </w:rPr>
-        <w:t xml:space="preserve">Opinión de la Gerencia Legal y de Cumplimiento Normativo: </w:t>
-      </w:r>
-      <w:r>
-        <w:rPr>
-          <w:rFonts w:ascii="Arial" w:eastAsia="Times New Roman" w:hAnsi="Arial" w:cs="Arial"/>
-          <w:kern w:val="0"/>
-          <w:lang w:eastAsia="es-SV"/>
-          <w14:ligatures w14:val="none"/>
-        </w:rPr>
-        <w:t xml:space="preserve">no existen elementos objetivos que permitan concluir que las garantías prendarias constituidas a favor de COMÉDICA DE R.L. hayan perdido eficacia jurídica o se encuentren afectadas por restricciones registrales. Asimismo, no existe fundamento contractual o legal suficiente para inmovilizar, compensar, retener o restringir de forma unilateral los fondos de la cuenta de Ahorro Premium mientras no exista orden de autoridad competente, siendo procedente la constitución de una reserva interna de monitoreo y seguimiento reforzado, conforme a lo instruido por el Consejo de Administración.</w:t>
+          <w:kern w:val="0"/>
+          <w:lang w:eastAsia="es-SV"/>
+          <w14:ligatures w14:val="none"/>
+        </w:rPr>
+        <w:t xml:space="preserve">El 04 de marzo de 2026, la FGR informó que se decretó instrucción formal con detención provisional contra los integrantes de dicha estructura, por lo que el proceso penal se encuentra en curso y no existe, a la fecha, sentencia condenatoria conocida. Las fuentes públicas no detallan el rol específico atribuido a la persona señalada, por lo que es necesario confirmar la identidad (número de DUI) para descartar un caso de homonimia.</w:t>
       </w:r>
     </w:p>
     <w:p>
@@ -529,6 +529,58 @@
           <w:lang w:eastAsia="es-SV"/>
           <w14:ligatures w14:val="none"/>
         </w:rPr>
+        <w:t xml:space="preserve">Opinión de la Gerencia Legal y de Cumplimiento Normativo: </w:t>
+      </w:r>
+      <w:r>
+        <w:rPr>
+          <w:rFonts w:ascii="Arial" w:eastAsia="Times New Roman" w:hAnsi="Arial" w:cs="Arial"/>
+          <w:kern w:val="0"/>
+          <w:lang w:eastAsia="es-SV"/>
+          <w14:ligatures w14:val="none"/>
+        </w:rPr>
+        <w:t xml:space="preserve">no existen elementos objetivos que permitan concluir que las garantías prendarias constituidas a favor de COMÉDICA DE R.L. hayan perdido eficacia jurídica o se encuentren afectadas por restricciones registrales. Asimismo, no existe fundamento contractual o legal suficiente para inmovilizar, compensar, retener o restringir de forma unilateral los fondos de la cuenta de Ahorro Premium mientras no exista orden de autoridad competente, siendo procedente la constitución de una reserva interna de monitoreo y seguimiento reforzado, conforme a lo instruido por el Consejo de Administración.</w:t>
+      </w:r>
+    </w:p>
+    <w:p>
+      <w:pPr>
+        <w:pStyle w:val="Prrafodelista"/>
+        <w:spacing w:line="360" w:lineRule="auto"/>
+        <w:ind w:left="-2880"/>
+        <w:jc w:val="both"/>
+        <w:rPr>
+          <w:rFonts w:ascii="Arial" w:eastAsia="Times New Roman" w:hAnsi="Arial" w:cs="Arial"/>
+          <w:kern w:val="0"/>
+          <w:lang w:eastAsia="es-SV"/>
+          <w14:ligatures w14:val="none"/>
+        </w:rPr>
+      </w:pPr>
+    </w:p>
+    <w:p>
+      <w:pPr>
+        <w:pStyle w:val="Prrafodelista"/>
+        <w:numPr>
+          <w:ilvl w:val="0"/>
+          <w:numId w:val="24"/>
+        </w:numPr>
+        <w:spacing w:line="360" w:lineRule="auto"/>
+        <w:ind w:left="360"/>
+        <w:jc w:val="both"/>
+        <w:rPr>
+          <w:rFonts w:ascii="Arial" w:eastAsia="Times New Roman" w:hAnsi="Arial" w:cs="Arial"/>
+          <w:kern w:val="0"/>
+          <w:lang w:eastAsia="es-SV"/>
+          <w14:ligatures w14:val="none"/>
+        </w:rPr>
+      </w:pPr>
+      <w:r>
+        <w:rPr>
+          <w:rFonts w:ascii="Arial" w:eastAsia="Times New Roman" w:hAnsi="Arial" w:cs="Arial"/>
+          <w:b/>
+          <w:bCs/>
+          <w:kern w:val="0"/>
+          <w:lang w:eastAsia="es-SV"/>
+          <w14:ligatures w14:val="none"/>
+        </w:rPr>
         <w:t xml:space="preserve">Opinión de la Oficialía de Cumplimiento: </w:t>
       </w:r>
       <w:r>
@@ -621,7 +673,7 @@
           <w:lang w:eastAsia="es-SV"/>
           <w14:ligatures w14:val="none"/>
         </w:rPr>
-        <w:t xml:space="preserve">No se identifican evidencias de deterioro en la capacidad de pago, incumplimiento de obligaciones, insuficiencia de garantías o factores que afecten la recuperación de los créditos; las garantías prendarias conservan su eficacia jurídica según la Gerencia Legal y el crédito hipotecario se encuentra respaldado por el inmueble otorgado en garantía. De conformidad con la NCB-022, la situación analizada no constituye por sí misma una causal de reclasificación de la categoría de riesgo crediticio. No obstante, la detención provisional reportada podría afectar la fuente de ingresos del asociado, por lo que la atención de las obligaciones depende actualmente de los fondos de la cuenta Premium. </w:t>
+        <w:t xml:space="preserve">Actualmente los créditos se encuentran al día y no existe incumplimiento de obligaciones; las garantías prendarias conservan su eficacia jurídica según la Gerencia Legal y el crédito hipotecario se encuentra respaldado por el inmueble otorgado en garantía. De conformidad con la NCB-022, la situación analizada no constituye por sí misma una causal de reclasificación de la categoría de riesgo crediticio. No obstante, la atención de las obligaciones depende exclusivamente del saldo disponible en la cuenta Premium (US$41,866.92), el cual, con descuentos mensuales de US$2,370.00 y sin evidencia de nuevos ingresos que lo repongan, se agotaría en aproximadamente 17 meses, proyectándose morosidad a partir del cierre de marzo de 2028. La detención provisional reportada podría limitar la generación de ingresos del asociado, por lo que existe un riesgo de deterioro previsible en el mediano plazo, cuya recuperación dependería de la ejecución de la garantía hipotecaria. </w:t>
       </w:r>
       <w:r>
         <w:rPr>
@@ -632,7 +684,7 @@
           <w:lang w:eastAsia="es-SV"/>
           <w14:ligatures w14:val="none"/>
         </w:rPr>
-        <w:t xml:space="preserve">Nivel de riesgo: Medio.</w:t>
+        <w:t xml:space="preserve">Nivel de riesgo: Medio-Alto.</w:t>
       </w:r>
     </w:p>
     <w:p>
@@ -1025,7 +1077,7 @@
           <w:lang w:eastAsia="es-SV"/>
           <w14:ligatures w14:val="none"/>
         </w:rPr>
-        <w:t xml:space="preserve">Conforme a la NCB-022, no se identifican fundamentos técnicos que sustenten una reclasificación de la categoría de riesgo crediticio del asociado.</w:t>
+        <w:t xml:space="preserve">El pago de los créditos depende exclusivamente del saldo disponible en la cuenta Premium, el cual cubriría aproximadamente 17 meses de cuotas; de continuar esta tendencia, se proyecta morosidad a partir del cierre de marzo de 2028, siendo necesario recurrir a la garantía hipotecaria para la recuperación del saldo insoluto.</w:t>
       </w:r>
     </w:p>
     <w:p>
@@ -1051,6 +1103,32 @@
           <w:lang w:eastAsia="es-SV"/>
           <w14:ligatures w14:val="none"/>
         </w:rPr>
+        <w:t xml:space="preserve">Conforme a la NCB-022, no se identifican fundamentos técnicos que sustenten una reclasificación de la categoría de riesgo crediticio del asociado.</w:t>
+      </w:r>
+    </w:p>
+    <w:p>
+      <w:pPr>
+        <w:pStyle w:val="Prrafodelista"/>
+        <w:numPr>
+          <w:ilvl w:val="0"/>
+          <w:numId w:val="25"/>
+        </w:numPr>
+        <w:spacing w:line="360" w:lineRule="auto"/>
+        <w:jc w:val="both"/>
+        <w:rPr>
+          <w:rFonts w:ascii="Arial" w:eastAsia="Times New Roman" w:hAnsi="Arial" w:cs="Arial"/>
+          <w:kern w:val="0"/>
+          <w:lang w:eastAsia="es-SV"/>
+          <w14:ligatures w14:val="none"/>
+        </w:rPr>
+      </w:pPr>
+      <w:r>
+        <w:rPr>
+          <w:rFonts w:ascii="Arial" w:eastAsia="Times New Roman" w:hAnsi="Arial" w:cs="Arial"/>
+          <w:kern w:val="0"/>
+          <w:lang w:eastAsia="es-SV"/>
+          <w14:ligatures w14:val="none"/>
+        </w:rPr>
         <w:t xml:space="preserve">Se observa una mayor exposición en materia reputacional, legal, operacional y de lavado de dinero, derivada del proceso penal en curso de conocimiento público; la Oficialía de Cumplimiento mantiene un perfil Medio-Alto, sujeto a revisión.</w:t>
       </w:r>
     </w:p>
@@ -1072,7 +1150,7 @@
           <w:lang w:eastAsia="es-SV"/>
           <w14:ligatures w14:val="none"/>
         </w:rPr>
-        <w:t xml:space="preserve">Existen elementos mitigantes como el comportamiento de pago al día, las garantías prendarias e hipotecaria vigentes y el respaldo de los fondos de la cuenta Premium, los cuales deben ser considerados en conjunto con los riesgos identificados. En virtud de lo anterior, resulta razonable mantener la reserva interna aprobada por el Consejo de Administración como mecanismo preventivo de monitoreo reforzado y control institucional.</w:t>
+        <w:t xml:space="preserve">Existen elementos mitigantes como el comportamiento de pago al día, las garantías prendarias e hipotecaria vigentes y el respaldo temporal de los fondos de la cuenta Premium, los cuales deben ser considerados en conjunto con los riesgos identificados. En virtud de lo anterior, resulta razonable mantener la reserva interna aprobada por el Consejo de Administración como mecanismo preventivo de monitoreo reforzado y control institucional.</w:t>
       </w:r>
     </w:p>
     <w:p>
@@ -1224,31 +1302,7 @@
           <w:lang w:eastAsia="es-SV"/>
           <w14:ligatures w14:val="none"/>
         </w:rPr>
-        <w:t xml:space="preserve">Reevaluar el perfil de riesgo cuando existan cambios materiales en la capacidad de pago, comportamiento crediticio o garantías, o cuando se emita una medida formal por autoridad competente.</w:t>
-      </w:r>
-    </w:p>
-    <w:p>
-      <w:pPr>
-        <w:keepNext/>
-        <w:spacing w:before="100" w:beforeAutospacing="1" w:after="100" w:afterAutospacing="1" w:line="360" w:lineRule="auto"/>
-        <w:jc w:val="both"/>
-        <w:rPr>
-          <w:rFonts w:ascii="Arial" w:eastAsia="Times New Roman" w:hAnsi="Arial" w:cs="Arial"/>
-          <w:kern w:val="0"/>
-          <w:lang w:eastAsia="es-SV"/>
-          <w14:ligatures w14:val="none"/>
-        </w:rPr>
-      </w:pPr>
-      <w:r>
-        <w:rPr>
-          <w:rFonts w:ascii="Arial" w:eastAsia="Times New Roman" w:hAnsi="Arial" w:cs="Arial"/>
-          <w:b/>
-          <w:bCs/>
-          <w:kern w:val="0"/>
-          <w:lang w:eastAsia="es-SV"/>
-          <w14:ligatures w14:val="none"/>
-        </w:rPr>
-        <w:t xml:space="preserve">Gerencia Legal y de Cumplimiento Normativo:</w:t>
+        <w:t xml:space="preserve">Dar seguimiento mensual al saldo disponible de la cuenta Premium frente a las cuotas de los tres créditos y reevaluar la categoría de riesgo con anticipación al agotamiento proyectado de los fondos (marzo de 2028), sin esperar a que se materialice la mora.</w:t>
       </w:r>
     </w:p>
     <w:p>
@@ -1273,7 +1327,31 @@
           <w:lang w:eastAsia="es-SV"/>
           <w14:ligatures w14:val="none"/>
         </w:rPr>
-        <w:t xml:space="preserve">No inmovilizar, compensar, retener ni restringir de forma unilateral los fondos de la cuenta de Ahorro Premium mientras no exista orden de autoridad competente o causal legal expresamente aplicable.</w:t>
+        <w:t xml:space="preserve">Reevaluar el perfil de riesgo cuando existan cambios materiales en la capacidad de pago, comportamiento crediticio o garantías, o cuando se emita una medida formal por autoridad competente.</w:t>
+      </w:r>
+    </w:p>
+    <w:p>
+      <w:pPr>
+        <w:keepNext/>
+        <w:spacing w:before="100" w:beforeAutospacing="1" w:after="100" w:afterAutospacing="1" w:line="360" w:lineRule="auto"/>
+        <w:jc w:val="both"/>
+        <w:rPr>
+          <w:rFonts w:ascii="Arial" w:eastAsia="Times New Roman" w:hAnsi="Arial" w:cs="Arial"/>
+          <w:kern w:val="0"/>
+          <w:lang w:eastAsia="es-SV"/>
+          <w14:ligatures w14:val="none"/>
+        </w:rPr>
+      </w:pPr>
+      <w:r>
+        <w:rPr>
+          <w:rFonts w:ascii="Arial" w:eastAsia="Times New Roman" w:hAnsi="Arial" w:cs="Arial"/>
+          <w:b/>
+          <w:bCs/>
+          <w:kern w:val="0"/>
+          <w:lang w:eastAsia="es-SV"/>
+          <w14:ligatures w14:val="none"/>
+        </w:rPr>
+        <w:t xml:space="preserve">Gerencia Legal y de Cumplimiento Normativo:</w:t>
       </w:r>
     </w:p>
     <w:p>
@@ -1298,7 +1376,7 @@
           <w:lang w:eastAsia="es-SV"/>
           <w14:ligatures w14:val="none"/>
         </w:rPr>
-        <w:t xml:space="preserve">Acatar la instrucción del Consejo de Administración mediante la constitución de la reserva interna de monitoreo y seguimiento reforzado sobre los haberes del asociado.</w:t>
+        <w:t xml:space="preserve">No inmovilizar, compensar, retener ni restringir de forma unilateral los fondos de la cuenta de Ahorro Premium mientras no exista orden de autoridad competente o causal legal expresamente aplicable.</w:t>
       </w:r>
     </w:p>
     <w:p>
@@ -1323,7 +1401,7 @@
           <w:lang w:eastAsia="es-SV"/>
           <w14:ligatures w14:val="none"/>
         </w:rPr>
-        <w:t xml:space="preserve">Realizar consultas periódicas en el Registro Público de Vehículos Automotores, en el Registro de la Propiedad Raíz e Hipotecas del CNR y demás fuentes disponibles, para identificar oportunamente cualquier medida que afecte los bienes dados en garantía o los derechos crediticios de COMÉDICA DE R.L.</w:t>
+        <w:t xml:space="preserve">Acatar la instrucción del Consejo de Administración mediante la constitución de la reserva interna de monitoreo y seguimiento reforzado sobre los haberes del asociado.</w:t>
       </w:r>
     </w:p>
     <w:p>
@@ -1348,7 +1426,7 @@
           <w:lang w:eastAsia="es-SV"/>
           <w14:ligatures w14:val="none"/>
         </w:rPr>
-        <w:t xml:space="preserve">En caso de notificarse una medida judicial, fiscal o administrativa que afecte los bienes, derechos o haberes del asociado, proceder de inmediato a su cumplimiento y adoptar las acciones necesarias para salvaguardar los intereses de la Institución.</w:t>
+        <w:t xml:space="preserve">Realizar consultas periódicas en el Registro Público de Vehículos Automotores, en el Registro de la Propiedad Raíz e Hipotecas del CNR y demás fuentes disponibles, para identificar oportunamente cualquier medida que afecte los bienes dados en garantía o los derechos crediticios de COMÉDICA DE R.L.</w:t>
       </w:r>
     </w:p>
     <w:p>
@@ -1373,31 +1451,7 @@
           <w:lang w:eastAsia="es-SV"/>
           <w14:ligatures w14:val="none"/>
         </w:rPr>
-        <w:t xml:space="preserve">Mientras no exista incumplimiento contractual, afectación registral de las garantías o notificación oficial de medidas, no se advierte la necesidad de promover acciones legales adicionales.</w:t>
-      </w:r>
-    </w:p>
-    <w:p>
-      <w:pPr>
-        <w:keepNext/>
-        <w:spacing w:before="100" w:beforeAutospacing="1" w:after="100" w:afterAutospacing="1" w:line="360" w:lineRule="auto"/>
-        <w:jc w:val="both"/>
-        <w:rPr>
-          <w:rFonts w:ascii="Arial" w:eastAsia="Times New Roman" w:hAnsi="Arial" w:cs="Arial"/>
-          <w:kern w:val="0"/>
-          <w:lang w:eastAsia="es-SV"/>
-          <w14:ligatures w14:val="none"/>
-        </w:rPr>
-      </w:pPr>
-      <w:r>
-        <w:rPr>
-          <w:rFonts w:ascii="Arial" w:eastAsia="Times New Roman" w:hAnsi="Arial" w:cs="Arial"/>
-          <w:b/>
-          <w:bCs/>
-          <w:kern w:val="0"/>
-          <w:lang w:eastAsia="es-SV"/>
-          <w14:ligatures w14:val="none"/>
-        </w:rPr>
-        <w:t xml:space="preserve">Oficialía de Cumplimiento:</w:t>
+        <w:t xml:space="preserve">En caso de notificarse una medida judicial, fiscal o administrativa que afecte los bienes, derechos o haberes del asociado, proceder de inmediato a su cumplimiento y adoptar las acciones necesarias para salvaguardar los intereses de la Institución.</w:t>
       </w:r>
     </w:p>
     <w:p>
@@ -1422,7 +1476,7 @@
           <w:lang w:eastAsia="es-SV"/>
           <w14:ligatures w14:val="none"/>
         </w:rPr>
-        <w:t xml:space="preserve">Mantener el perfil de riesgo del asociado en Medio-Alto y efectuar la revisión posterior prevista, valorando su reclasificación conforme a la normativa de prevención de lavado de dinero y financiamiento al terrorismo.</w:t>
+        <w:t xml:space="preserve">Prever, en caso de materializarse la mora proyectada, las acciones de recuperación del saldo insoluto mediante la ejecución de la garantía hipotecaria y, de ser necesario, de las garantías prendarias, verificando previamente su situación registral.</w:t>
       </w:r>
     </w:p>
     <w:p>
@@ -1447,7 +1501,31 @@
           <w:lang w:eastAsia="es-SV"/>
           <w14:ligatures w14:val="none"/>
         </w:rPr>
-        <w:t xml:space="preserve">Confirmar la identidad del asociado frente a la información pública (descartar homonimia), aplicar debida diligencia reforzada y validar el origen de los fondos de la cuenta Premium.</w:t>
+        <w:t xml:space="preserve">Mientras no exista incumplimiento contractual, afectación registral de las garantías o notificación oficial de medidas, no se advierte la necesidad de promover acciones legales adicionales.</w:t>
+      </w:r>
+    </w:p>
+    <w:p>
+      <w:pPr>
+        <w:keepNext/>
+        <w:spacing w:before="100" w:beforeAutospacing="1" w:after="100" w:afterAutospacing="1" w:line="360" w:lineRule="auto"/>
+        <w:jc w:val="both"/>
+        <w:rPr>
+          <w:rFonts w:ascii="Arial" w:eastAsia="Times New Roman" w:hAnsi="Arial" w:cs="Arial"/>
+          <w:kern w:val="0"/>
+          <w:lang w:eastAsia="es-SV"/>
+          <w14:ligatures w14:val="none"/>
+        </w:rPr>
+      </w:pPr>
+      <w:r>
+        <w:rPr>
+          <w:rFonts w:ascii="Arial" w:eastAsia="Times New Roman" w:hAnsi="Arial" w:cs="Arial"/>
+          <w:b/>
+          <w:bCs/>
+          <w:kern w:val="0"/>
+          <w:lang w:eastAsia="es-SV"/>
+          <w14:ligatures w14:val="none"/>
+        </w:rPr>
+        <w:t xml:space="preserve">Oficialía de Cumplimiento:</w:t>
       </w:r>
     </w:p>
     <w:p>
@@ -1472,31 +1550,7 @@
           <w:lang w:eastAsia="es-SV"/>
           <w14:ligatures w14:val="none"/>
         </w:rPr>
-        <w:t xml:space="preserve">Evaluar, dentro del ámbito de sus competencias, la pertinencia de un Reporte de Operación Sospechosa ante la UIF.</w:t>
-      </w:r>
-    </w:p>
-    <w:p>
-      <w:pPr>
-        <w:keepNext/>
-        <w:spacing w:before="100" w:beforeAutospacing="1" w:after="100" w:afterAutospacing="1" w:line="360" w:lineRule="auto"/>
-        <w:jc w:val="both"/>
-        <w:rPr>
-          <w:rFonts w:ascii="Arial" w:eastAsia="Times New Roman" w:hAnsi="Arial" w:cs="Arial"/>
-          <w:kern w:val="0"/>
-          <w:lang w:eastAsia="es-SV"/>
-          <w14:ligatures w14:val="none"/>
-        </w:rPr>
-      </w:pPr>
-      <w:r>
-        <w:rPr>
-          <w:rFonts w:ascii="Arial" w:eastAsia="Times New Roman" w:hAnsi="Arial" w:cs="Arial"/>
-          <w:b/>
-          <w:bCs/>
-          <w:kern w:val="0"/>
-          <w:lang w:eastAsia="es-SV"/>
-          <w14:ligatures w14:val="none"/>
-        </w:rPr>
-        <w:t xml:space="preserve">Departamento de Soluciones Financieras:</w:t>
+        <w:t xml:space="preserve">Mantener el perfil de riesgo del asociado en Medio-Alto y efectuar la revisión posterior prevista, valorando su reclasificación conforme a la normativa de prevención de lavado de dinero y financiamiento al terrorismo.</w:t>
       </w:r>
     </w:p>
     <w:p>
@@ -1521,7 +1575,7 @@
           <w:lang w:eastAsia="es-SV"/>
           <w14:ligatures w14:val="none"/>
         </w:rPr>
-        <w:t xml:space="preserve">Solicitar a la Gerencia Legal y de Cumplimiento Normativo ampliar su opinión jurídica sobre la garantía hipotecaria, verificando su vigencia e inscripción y que no existan anotaciones o restricciones registrales sobre el inmueble.</w:t>
+        <w:t xml:space="preserve">Confirmar la identidad del asociado frente a la información pública (descartar homonimia), aplicar debida diligencia reforzada y validar el origen de los fondos de la cuenta Premium.</w:t>
       </w:r>
     </w:p>
     <w:p>
@@ -1546,7 +1600,31 @@
           <w:lang w:eastAsia="es-SV"/>
           <w14:ligatures w14:val="none"/>
         </w:rPr>
-        <w:t xml:space="preserve">Mantener monitoreo permanente y reforzado del comportamiento de pago de los tres créditos (dos prendarios y uno hipotecario), informando oportunamente cualquier deterioro en la capacidad de cumplimiento del asociado.</w:t>
+        <w:t xml:space="preserve">Evaluar, dentro del ámbito de sus competencias, la pertinencia de un Reporte de Operación Sospechosa ante la UIF.</w:t>
+      </w:r>
+    </w:p>
+    <w:p>
+      <w:pPr>
+        <w:keepNext/>
+        <w:spacing w:before="100" w:beforeAutospacing="1" w:after="100" w:afterAutospacing="1" w:line="360" w:lineRule="auto"/>
+        <w:jc w:val="both"/>
+        <w:rPr>
+          <w:rFonts w:ascii="Arial" w:eastAsia="Times New Roman" w:hAnsi="Arial" w:cs="Arial"/>
+          <w:kern w:val="0"/>
+          <w:lang w:eastAsia="es-SV"/>
+          <w14:ligatures w14:val="none"/>
+        </w:rPr>
+      </w:pPr>
+      <w:r>
+        <w:rPr>
+          <w:rFonts w:ascii="Arial" w:eastAsia="Times New Roman" w:hAnsi="Arial" w:cs="Arial"/>
+          <w:b/>
+          <w:bCs/>
+          <w:kern w:val="0"/>
+          <w:lang w:eastAsia="es-SV"/>
+          <w14:ligatures w14:val="none"/>
+        </w:rPr>
+        <w:t xml:space="preserve">Departamento de Soluciones Financieras:</w:t>
       </w:r>
     </w:p>
     <w:p>
@@ -1571,31 +1649,7 @@
           <w:lang w:eastAsia="es-SV"/>
           <w14:ligatures w14:val="none"/>
         </w:rPr>
-        <w:t xml:space="preserve">Verificar y actualizar los beneficiarios designados en la cuenta de Ahorro Premium y la información del expediente.</w:t>
-      </w:r>
-    </w:p>
-    <w:p>
-      <w:pPr>
-        <w:keepNext/>
-        <w:spacing w:before="100" w:beforeAutospacing="1" w:after="100" w:afterAutospacing="1" w:line="360" w:lineRule="auto"/>
-        <w:jc w:val="both"/>
-        <w:rPr>
-          <w:rFonts w:ascii="Arial" w:eastAsia="Times New Roman" w:hAnsi="Arial" w:cs="Arial"/>
-          <w:kern w:val="0"/>
-          <w:lang w:eastAsia="es-SV"/>
-          <w14:ligatures w14:val="none"/>
-        </w:rPr>
-      </w:pPr>
-      <w:r>
-        <w:rPr>
-          <w:rFonts w:ascii="Arial" w:eastAsia="Times New Roman" w:hAnsi="Arial" w:cs="Arial"/>
-          <w:b/>
-          <w:bCs/>
-          <w:kern w:val="0"/>
-          <w:lang w:eastAsia="es-SV"/>
-          <w14:ligatures w14:val="none"/>
-        </w:rPr>
-        <w:t xml:space="preserve">Alertas institucionales a mantener activas:</w:t>
+        <w:t xml:space="preserve">Solicitar a la Gerencia Legal y de Cumplimiento Normativo ampliar su opinión jurídica sobre la garantía hipotecaria, verificando su vigencia e inscripción y que no existan anotaciones o restricciones registrales sobre el inmueble.</w:t>
       </w:r>
     </w:p>
     <w:p>
@@ -1616,22 +1670,11 @@
       <w:r>
         <w:rPr>
           <w:rFonts w:ascii="Arial" w:eastAsia="Times New Roman" w:hAnsi="Arial" w:cs="Arial"/>
-          <w:b/>
-          <w:bCs/>
-          <w:kern w:val="0"/>
-          <w:lang w:eastAsia="es-SV"/>
-          <w14:ligatures w14:val="none"/>
-        </w:rPr>
-        <w:t xml:space="preserve">Alerta reputacional: </w:t>
-      </w:r>
-      <w:r>
-        <w:rPr>
-          <w:rFonts w:ascii="Arial" w:eastAsia="Times New Roman" w:hAnsi="Arial" w:cs="Arial"/>
-          <w:kern w:val="0"/>
-          <w:lang w:eastAsia="es-SV"/>
-          <w14:ligatures w14:val="none"/>
-        </w:rPr>
-        <w:t xml:space="preserve">seguimiento permanente de información pública y del avance del proceso penal relacionado con el asociado.</w:t>
+          <w:kern w:val="0"/>
+          <w:lang w:eastAsia="es-SV"/>
+          <w14:ligatures w14:val="none"/>
+        </w:rPr>
+        <w:t xml:space="preserve">Mantener monitoreo permanente y reforzado del comportamiento de pago de los tres créditos (dos prendarios y uno hipotecario), informando oportunamente cualquier deterioro en la capacidad de cumplimiento del asociado.</w:t>
       </w:r>
     </w:p>
     <w:p>
@@ -1652,22 +1695,11 @@
       <w:r>
         <w:rPr>
           <w:rFonts w:ascii="Arial" w:eastAsia="Times New Roman" w:hAnsi="Arial" w:cs="Arial"/>
-          <w:b/>
-          <w:bCs/>
-          <w:kern w:val="0"/>
-          <w:lang w:eastAsia="es-SV"/>
-          <w14:ligatures w14:val="none"/>
-        </w:rPr>
-        <w:t xml:space="preserve">Alerta de cumplimiento: </w:t>
-      </w:r>
-      <w:r>
-        <w:rPr>
-          <w:rFonts w:ascii="Arial" w:eastAsia="Times New Roman" w:hAnsi="Arial" w:cs="Arial"/>
-          <w:kern w:val="0"/>
-          <w:lang w:eastAsia="es-SV"/>
-          <w14:ligatures w14:val="none"/>
-        </w:rPr>
-        <w:t xml:space="preserve">debida diligencia reforzada y monitoreo de operaciones relevantes por parte de la Oficialía de Cumplimiento.</w:t>
+          <w:kern w:val="0"/>
+          <w:lang w:eastAsia="es-SV"/>
+          <w14:ligatures w14:val="none"/>
+        </w:rPr>
+        <w:t xml:space="preserve">Gestionar un acercamiento con el asociado o su representante para identificar fuentes alternas de pago y, de ser procedente, evaluar con anticipación alternativas de normalización de las obligaciones antes del agotamiento de los fondos de la cuenta Premium.</w:t>
       </w:r>
     </w:p>
     <w:p>
@@ -1688,22 +1720,11 @@
       <w:r>
         <w:rPr>
           <w:rFonts w:ascii="Arial" w:eastAsia="Times New Roman" w:hAnsi="Arial" w:cs="Arial"/>
-          <w:b/>
-          <w:bCs/>
-          <w:kern w:val="0"/>
-          <w:lang w:eastAsia="es-SV"/>
-          <w14:ligatures w14:val="none"/>
-        </w:rPr>
-        <w:t xml:space="preserve">Alerta de control sobre la cuenta de Ahorro Premium: </w:t>
-      </w:r>
-      <w:r>
-        <w:rPr>
-          <w:rFonts w:ascii="Arial" w:eastAsia="Times New Roman" w:hAnsi="Arial" w:cs="Arial"/>
-          <w:kern w:val="0"/>
-          <w:lang w:eastAsia="es-SV"/>
-          <w14:ligatures w14:val="none"/>
-        </w:rPr>
-        <w:t xml:space="preserve">toda solicitud de cancelación anticipada, retiro extraordinario o transacción que se aparte del comportamiento histórico deberá ser revisada previamente por Riesgos, Cumplimiento y la Gerencia Legal antes de su ejecución.</w:t>
+          <w:kern w:val="0"/>
+          <w:lang w:eastAsia="es-SV"/>
+          <w14:ligatures w14:val="none"/>
+        </w:rPr>
+        <w:t xml:space="preserve">Actualizar el avalúo del inmueble otorgado en garantía hipotecaria, a fin de determinar la cobertura real del saldo insoluto ante una eventual ejecución.</w:t>
       </w:r>
     </w:p>
     <w:p>
@@ -1724,22 +1745,35 @@
       <w:r>
         <w:rPr>
           <w:rFonts w:ascii="Arial" w:eastAsia="Times New Roman" w:hAnsi="Arial" w:cs="Arial"/>
+          <w:kern w:val="0"/>
+          <w:lang w:eastAsia="es-SV"/>
+          <w14:ligatures w14:val="none"/>
+        </w:rPr>
+        <w:t xml:space="preserve">Verificar y actualizar los beneficiarios designados en la cuenta de Ahorro Premium y la información del expediente.</w:t>
+      </w:r>
+    </w:p>
+    <w:p>
+      <w:pPr>
+        <w:keepNext/>
+        <w:spacing w:before="100" w:beforeAutospacing="1" w:after="100" w:afterAutospacing="1" w:line="360" w:lineRule="auto"/>
+        <w:jc w:val="both"/>
+        <w:rPr>
+          <w:rFonts w:ascii="Arial" w:eastAsia="Times New Roman" w:hAnsi="Arial" w:cs="Arial"/>
+          <w:kern w:val="0"/>
+          <w:lang w:eastAsia="es-SV"/>
+          <w14:ligatures w14:val="none"/>
+        </w:rPr>
+      </w:pPr>
+      <w:r>
+        <w:rPr>
+          <w:rFonts w:ascii="Arial" w:eastAsia="Times New Roman" w:hAnsi="Arial" w:cs="Arial"/>
           <w:b/>
           <w:bCs/>
           <w:kern w:val="0"/>
           <w:lang w:eastAsia="es-SV"/>
           <w14:ligatures w14:val="none"/>
         </w:rPr>
-        <w:t xml:space="preserve">Alerta de garantías: </w:t>
-      </w:r>
-      <w:r>
-        <w:rPr>
-          <w:rFonts w:ascii="Arial" w:eastAsia="Times New Roman" w:hAnsi="Arial" w:cs="Arial"/>
-          <w:kern w:val="0"/>
-          <w:lang w:eastAsia="es-SV"/>
-          <w14:ligatures w14:val="none"/>
-        </w:rPr>
-        <w:t xml:space="preserve">consulta periódica en el Registro Público de Vehículos Automotores y en el Registro de la Propiedad Raíz e Hipotecas del CNR para detectar anotaciones preventivas, medidas cautelares, secuestro, embargo o decomiso sobre los bienes dados en prenda e hipoteca.</w:t>
+        <w:t xml:space="preserve">Alertas institucionales a mantener activas:</w:t>
       </w:r>
     </w:p>
     <w:p>
@@ -1766,6 +1800,150 @@
           <w:lang w:eastAsia="es-SV"/>
           <w14:ligatures w14:val="none"/>
         </w:rPr>
+        <w:t xml:space="preserve">Alerta reputacional: </w:t>
+      </w:r>
+      <w:r>
+        <w:rPr>
+          <w:rFonts w:ascii="Arial" w:eastAsia="Times New Roman" w:hAnsi="Arial" w:cs="Arial"/>
+          <w:kern w:val="0"/>
+          <w:lang w:eastAsia="es-SV"/>
+          <w14:ligatures w14:val="none"/>
+        </w:rPr>
+        <w:t xml:space="preserve">seguimiento permanente de información pública y del avance del proceso penal relacionado con el asociado.</w:t>
+      </w:r>
+    </w:p>
+    <w:p>
+      <w:pPr>
+        <w:numPr>
+          <w:ilvl w:val="0"/>
+          <w:numId w:val="26"/>
+        </w:numPr>
+        <w:spacing w:line="360" w:lineRule="auto"/>
+        <w:jc w:val="both"/>
+        <w:rPr>
+          <w:rFonts w:ascii="Arial" w:eastAsia="Times New Roman" w:hAnsi="Arial" w:cs="Arial"/>
+          <w:kern w:val="0"/>
+          <w:lang w:eastAsia="es-SV"/>
+          <w14:ligatures w14:val="none"/>
+        </w:rPr>
+      </w:pPr>
+      <w:r>
+        <w:rPr>
+          <w:rFonts w:ascii="Arial" w:eastAsia="Times New Roman" w:hAnsi="Arial" w:cs="Arial"/>
+          <w:b/>
+          <w:bCs/>
+          <w:kern w:val="0"/>
+          <w:lang w:eastAsia="es-SV"/>
+          <w14:ligatures w14:val="none"/>
+        </w:rPr>
+        <w:t xml:space="preserve">Alerta de cumplimiento: </w:t>
+      </w:r>
+      <w:r>
+        <w:rPr>
+          <w:rFonts w:ascii="Arial" w:eastAsia="Times New Roman" w:hAnsi="Arial" w:cs="Arial"/>
+          <w:kern w:val="0"/>
+          <w:lang w:eastAsia="es-SV"/>
+          <w14:ligatures w14:val="none"/>
+        </w:rPr>
+        <w:t xml:space="preserve">debida diligencia reforzada y monitoreo de operaciones relevantes por parte de la Oficialía de Cumplimiento.</w:t>
+      </w:r>
+    </w:p>
+    <w:p>
+      <w:pPr>
+        <w:numPr>
+          <w:ilvl w:val="0"/>
+          <w:numId w:val="26"/>
+        </w:numPr>
+        <w:spacing w:line="360" w:lineRule="auto"/>
+        <w:jc w:val="both"/>
+        <w:rPr>
+          <w:rFonts w:ascii="Arial" w:eastAsia="Times New Roman" w:hAnsi="Arial" w:cs="Arial"/>
+          <w:kern w:val="0"/>
+          <w:lang w:eastAsia="es-SV"/>
+          <w14:ligatures w14:val="none"/>
+        </w:rPr>
+      </w:pPr>
+      <w:r>
+        <w:rPr>
+          <w:rFonts w:ascii="Arial" w:eastAsia="Times New Roman" w:hAnsi="Arial" w:cs="Arial"/>
+          <w:b/>
+          <w:bCs/>
+          <w:kern w:val="0"/>
+          <w:lang w:eastAsia="es-SV"/>
+          <w14:ligatures w14:val="none"/>
+        </w:rPr>
+        <w:t xml:space="preserve">Alerta de control sobre la cuenta de Ahorro Premium: </w:t>
+      </w:r>
+      <w:r>
+        <w:rPr>
+          <w:rFonts w:ascii="Arial" w:eastAsia="Times New Roman" w:hAnsi="Arial" w:cs="Arial"/>
+          <w:kern w:val="0"/>
+          <w:lang w:eastAsia="es-SV"/>
+          <w14:ligatures w14:val="none"/>
+        </w:rPr>
+        <w:t xml:space="preserve">toda solicitud de cancelación anticipada, retiro extraordinario o transacción que se aparte del comportamiento histórico deberá ser revisada previamente por Riesgos, Cumplimiento y la Gerencia Legal antes de su ejecución.</w:t>
+      </w:r>
+    </w:p>
+    <w:p>
+      <w:pPr>
+        <w:numPr>
+          <w:ilvl w:val="0"/>
+          <w:numId w:val="26"/>
+        </w:numPr>
+        <w:spacing w:line="360" w:lineRule="auto"/>
+        <w:jc w:val="both"/>
+        <w:rPr>
+          <w:rFonts w:ascii="Arial" w:eastAsia="Times New Roman" w:hAnsi="Arial" w:cs="Arial"/>
+          <w:kern w:val="0"/>
+          <w:lang w:eastAsia="es-SV"/>
+          <w14:ligatures w14:val="none"/>
+        </w:rPr>
+      </w:pPr>
+      <w:r>
+        <w:rPr>
+          <w:rFonts w:ascii="Arial" w:eastAsia="Times New Roman" w:hAnsi="Arial" w:cs="Arial"/>
+          <w:b/>
+          <w:bCs/>
+          <w:kern w:val="0"/>
+          <w:lang w:eastAsia="es-SV"/>
+          <w14:ligatures w14:val="none"/>
+        </w:rPr>
+        <w:t xml:space="preserve">Alerta de garantías: </w:t>
+      </w:r>
+      <w:r>
+        <w:rPr>
+          <w:rFonts w:ascii="Arial" w:eastAsia="Times New Roman" w:hAnsi="Arial" w:cs="Arial"/>
+          <w:kern w:val="0"/>
+          <w:lang w:eastAsia="es-SV"/>
+          <w14:ligatures w14:val="none"/>
+        </w:rPr>
+        <w:t xml:space="preserve">consulta periódica en el Registro Público de Vehículos Automotores y en el Registro de la Propiedad Raíz e Hipotecas del CNR para detectar anotaciones preventivas, medidas cautelares, secuestro, embargo o decomiso sobre los bienes dados en prenda e hipoteca.</w:t>
+      </w:r>
+    </w:p>
+    <w:p>
+      <w:pPr>
+        <w:numPr>
+          <w:ilvl w:val="0"/>
+          <w:numId w:val="26"/>
+        </w:numPr>
+        <w:spacing w:line="360" w:lineRule="auto"/>
+        <w:jc w:val="both"/>
+        <w:rPr>
+          <w:rFonts w:ascii="Arial" w:eastAsia="Times New Roman" w:hAnsi="Arial" w:cs="Arial"/>
+          <w:kern w:val="0"/>
+          <w:lang w:eastAsia="es-SV"/>
+          <w14:ligatures w14:val="none"/>
+        </w:rPr>
+      </w:pPr>
+      <w:r>
+        <w:rPr>
+          <w:rFonts w:ascii="Arial" w:eastAsia="Times New Roman" w:hAnsi="Arial" w:cs="Arial"/>
+          <w:b/>
+          <w:bCs/>
+          <w:kern w:val="0"/>
+          <w:lang w:eastAsia="es-SV"/>
+          <w14:ligatures w14:val="none"/>
+        </w:rPr>
         <w:t xml:space="preserve">Alerta crediticia: </w:t>
       </w:r>
       <w:r>
@@ -1775,7 +1953,7 @@
           <w:lang w:eastAsia="es-SV"/>
           <w14:ligatures w14:val="none"/>
         </w:rPr>
-        <w:t xml:space="preserve">monitoreo reforzado del comportamiento de pago de los tres créditos (dos prendarios y uno hipotecario).</w:t>
+        <w:t xml:space="preserve">monitoreo reforzado del comportamiento de pago de los tres créditos (dos prendarios y uno hipotecario) y del saldo disponible de la cuenta Premium, el cual cubre aproximadamente 17 meses de cuotas (US$2,370.00 mensuales).</w:t>
       </w:r>
     </w:p>
     <w:p>

</xml_diff>

<commit_message>
DAR-2026-56: quitar bloque de recomendaciones de la Gerencia Legal
Co-Authored-By: Claude Opus 5.5 <noreply@anthropic.com>
Claude-Session: https://claude.ai/code/session_019v6pd36FfCTKWdmbaW6yXF
</commit_message>
<xml_diff>
--- a/DAR-2026-56_Opinion_Jonnathan_Jacobo_Marroquin.docx
+++ b/DAR-2026-56_Opinion_Jonnathan_Jacobo_Marroquin.docx
@@ -1328,180 +1328,6 @@
           <w14:ligatures w14:val="none"/>
         </w:rPr>
         <w:t xml:space="preserve">Reevaluar el perfil de riesgo cuando existan cambios materiales en la capacidad de pago, comportamiento crediticio o garantías, o cuando se emita una medida formal por autoridad competente.</w:t>
-      </w:r>
-    </w:p>
-    <w:p>
-      <w:pPr>
-        <w:keepNext/>
-        <w:spacing w:before="100" w:beforeAutospacing="1" w:after="100" w:afterAutospacing="1" w:line="360" w:lineRule="auto"/>
-        <w:jc w:val="both"/>
-        <w:rPr>
-          <w:rFonts w:ascii="Arial" w:eastAsia="Times New Roman" w:hAnsi="Arial" w:cs="Arial"/>
-          <w:kern w:val="0"/>
-          <w:lang w:eastAsia="es-SV"/>
-          <w14:ligatures w14:val="none"/>
-        </w:rPr>
-      </w:pPr>
-      <w:r>
-        <w:rPr>
-          <w:rFonts w:ascii="Arial" w:eastAsia="Times New Roman" w:hAnsi="Arial" w:cs="Arial"/>
-          <w:b/>
-          <w:bCs/>
-          <w:kern w:val="0"/>
-          <w:lang w:eastAsia="es-SV"/>
-          <w14:ligatures w14:val="none"/>
-        </w:rPr>
-        <w:t xml:space="preserve">Gerencia Legal y de Cumplimiento Normativo:</w:t>
-      </w:r>
-    </w:p>
-    <w:p>
-      <w:pPr>
-        <w:numPr>
-          <w:ilvl w:val="0"/>
-          <w:numId w:val="26"/>
-        </w:numPr>
-        <w:spacing w:line="360" w:lineRule="auto"/>
-        <w:jc w:val="both"/>
-        <w:rPr>
-          <w:rFonts w:ascii="Arial" w:eastAsia="Times New Roman" w:hAnsi="Arial" w:cs="Arial"/>
-          <w:kern w:val="0"/>
-          <w:lang w:eastAsia="es-SV"/>
-          <w14:ligatures w14:val="none"/>
-        </w:rPr>
-      </w:pPr>
-      <w:r>
-        <w:rPr>
-          <w:rFonts w:ascii="Arial" w:eastAsia="Times New Roman" w:hAnsi="Arial" w:cs="Arial"/>
-          <w:kern w:val="0"/>
-          <w:lang w:eastAsia="es-SV"/>
-          <w14:ligatures w14:val="none"/>
-        </w:rPr>
-        <w:t xml:space="preserve">No inmovilizar, compensar, retener ni restringir de forma unilateral los fondos de la cuenta de Ahorro Premium mientras no exista orden de autoridad competente o causal legal expresamente aplicable.</w:t>
-      </w:r>
-    </w:p>
-    <w:p>
-      <w:pPr>
-        <w:numPr>
-          <w:ilvl w:val="0"/>
-          <w:numId w:val="26"/>
-        </w:numPr>
-        <w:spacing w:line="360" w:lineRule="auto"/>
-        <w:jc w:val="both"/>
-        <w:rPr>
-          <w:rFonts w:ascii="Arial" w:eastAsia="Times New Roman" w:hAnsi="Arial" w:cs="Arial"/>
-          <w:kern w:val="0"/>
-          <w:lang w:eastAsia="es-SV"/>
-          <w14:ligatures w14:val="none"/>
-        </w:rPr>
-      </w:pPr>
-      <w:r>
-        <w:rPr>
-          <w:rFonts w:ascii="Arial" w:eastAsia="Times New Roman" w:hAnsi="Arial" w:cs="Arial"/>
-          <w:kern w:val="0"/>
-          <w:lang w:eastAsia="es-SV"/>
-          <w14:ligatures w14:val="none"/>
-        </w:rPr>
-        <w:t xml:space="preserve">Acatar la instrucción del Consejo de Administración mediante la constitución de la reserva interna de monitoreo y seguimiento reforzado sobre los haberes del asociado.</w:t>
-      </w:r>
-    </w:p>
-    <w:p>
-      <w:pPr>
-        <w:numPr>
-          <w:ilvl w:val="0"/>
-          <w:numId w:val="26"/>
-        </w:numPr>
-        <w:spacing w:line="360" w:lineRule="auto"/>
-        <w:jc w:val="both"/>
-        <w:rPr>
-          <w:rFonts w:ascii="Arial" w:eastAsia="Times New Roman" w:hAnsi="Arial" w:cs="Arial"/>
-          <w:kern w:val="0"/>
-          <w:lang w:eastAsia="es-SV"/>
-          <w14:ligatures w14:val="none"/>
-        </w:rPr>
-      </w:pPr>
-      <w:r>
-        <w:rPr>
-          <w:rFonts w:ascii="Arial" w:eastAsia="Times New Roman" w:hAnsi="Arial" w:cs="Arial"/>
-          <w:kern w:val="0"/>
-          <w:lang w:eastAsia="es-SV"/>
-          <w14:ligatures w14:val="none"/>
-        </w:rPr>
-        <w:t xml:space="preserve">Realizar consultas periódicas en el Registro Público de Vehículos Automotores, en el Registro de la Propiedad Raíz e Hipotecas del CNR y demás fuentes disponibles, para identificar oportunamente cualquier medida que afecte los bienes dados en garantía o los derechos crediticios de COMÉDICA DE R.L.</w:t>
-      </w:r>
-    </w:p>
-    <w:p>
-      <w:pPr>
-        <w:numPr>
-          <w:ilvl w:val="0"/>
-          <w:numId w:val="26"/>
-        </w:numPr>
-        <w:spacing w:line="360" w:lineRule="auto"/>
-        <w:jc w:val="both"/>
-        <w:rPr>
-          <w:rFonts w:ascii="Arial" w:eastAsia="Times New Roman" w:hAnsi="Arial" w:cs="Arial"/>
-          <w:kern w:val="0"/>
-          <w:lang w:eastAsia="es-SV"/>
-          <w14:ligatures w14:val="none"/>
-        </w:rPr>
-      </w:pPr>
-      <w:r>
-        <w:rPr>
-          <w:rFonts w:ascii="Arial" w:eastAsia="Times New Roman" w:hAnsi="Arial" w:cs="Arial"/>
-          <w:kern w:val="0"/>
-          <w:lang w:eastAsia="es-SV"/>
-          <w14:ligatures w14:val="none"/>
-        </w:rPr>
-        <w:t xml:space="preserve">En caso de notificarse una medida judicial, fiscal o administrativa que afecte los bienes, derechos o haberes del asociado, proceder de inmediato a su cumplimiento y adoptar las acciones necesarias para salvaguardar los intereses de la Institución.</w:t>
-      </w:r>
-    </w:p>
-    <w:p>
-      <w:pPr>
-        <w:numPr>
-          <w:ilvl w:val="0"/>
-          <w:numId w:val="26"/>
-        </w:numPr>
-        <w:spacing w:line="360" w:lineRule="auto"/>
-        <w:jc w:val="both"/>
-        <w:rPr>
-          <w:rFonts w:ascii="Arial" w:eastAsia="Times New Roman" w:hAnsi="Arial" w:cs="Arial"/>
-          <w:kern w:val="0"/>
-          <w:lang w:eastAsia="es-SV"/>
-          <w14:ligatures w14:val="none"/>
-        </w:rPr>
-      </w:pPr>
-      <w:r>
-        <w:rPr>
-          <w:rFonts w:ascii="Arial" w:eastAsia="Times New Roman" w:hAnsi="Arial" w:cs="Arial"/>
-          <w:kern w:val="0"/>
-          <w:lang w:eastAsia="es-SV"/>
-          <w14:ligatures w14:val="none"/>
-        </w:rPr>
-        <w:t xml:space="preserve">Prever, en caso de materializarse la mora proyectada, las acciones de recuperación del saldo insoluto mediante la ejecución de la garantía hipotecaria y, de ser necesario, de las garantías prendarias, verificando previamente su situación registral.</w:t>
-      </w:r>
-    </w:p>
-    <w:p>
-      <w:pPr>
-        <w:numPr>
-          <w:ilvl w:val="0"/>
-          <w:numId w:val="26"/>
-        </w:numPr>
-        <w:spacing w:line="360" w:lineRule="auto"/>
-        <w:jc w:val="both"/>
-        <w:rPr>
-          <w:rFonts w:ascii="Arial" w:eastAsia="Times New Roman" w:hAnsi="Arial" w:cs="Arial"/>
-          <w:kern w:val="0"/>
-          <w:lang w:eastAsia="es-SV"/>
-          <w14:ligatures w14:val="none"/>
-        </w:rPr>
-      </w:pPr>
-      <w:r>
-        <w:rPr>
-          <w:rFonts w:ascii="Arial" w:eastAsia="Times New Roman" w:hAnsi="Arial" w:cs="Arial"/>
-          <w:kern w:val="0"/>
-          <w:lang w:eastAsia="es-SV"/>
-          <w14:ligatures w14:val="none"/>
-        </w:rPr>
-        <w:t xml:space="preserve">Mientras no exista incumplimiento contractual, afectación registral de las garantías o notificación oficial de medidas, no se advierte la necesidad de promover acciones legales adicionales.</w:t>
       </w:r>
     </w:p>
     <w:p>

</xml_diff>